<commit_message>
Expand JEM command reference
</commit_message>
<xml_diff>
--- a/Docs/JEM_SMP_COMMANDS.docx
+++ b/Docs/JEM_SMP_COMMANDS.docx
@@ -33,13 +33,7 @@
     </w:p>
     <w:p>
       <w:r>
-        <w:rPr>
-          <w:rFonts w:ascii="Aptos" w:hAnsi="Aptos" w:eastAsia="Aptos"/>
-          <w:b w:val="0"/>
-          <w:color w:val="000000"/>
-          <w:sz w:val="21"/>
-        </w:rPr>
-        <w:t>Документ описывает все ветки /jem и /smp, которые регистрирует текущий исходный код проекта. Для каждой команды сначала дано короткое объяснение для игрока, затем точная механика: проверяемые условия, изменяемые данные, сетевые действия, права и реальные отказные пути. В приложении отдельно перечислены корневые команды, начинающиеся с jem, но не являющиеся подкомандами /jem.</w:t>
+        <w:t>Справочник перечисляет все ветви /jem и /smp, которые регистрируют наши модули для сервера. Для каждой команды сначала дано простое объяснение для игрока, затем точная механика: проверки доступа, обработка аргументов, права и ограничения, запись в данные, сетевые действия и ответы. Отдельные разделы охватывают остальные команды, добавленные JEM и серверной логикой этого модпака; команды сторонних модов из Modrinth не включены.</w:t>
       </w:r>
     </w:p>
     <w:p>
@@ -1063,6 +1057,514 @@
           </w:p>
         </w:tc>
       </w:tr>
+      <w:tr>
+        <w:trPr>
+          <w:cantSplit/>
+        </w:trPr>
+        <w:tc>
+          <w:tcPr>
+            <w:tcW w:type="dxa" w:w="3888"/>
+            <w:vAlign w:val="center"/>
+            <w:tcMar>
+              <w:top w:w="110" w:type="dxa"/>
+              <w:start w:w="120" w:type="dxa"/>
+              <w:bottom w:w="110" w:type="dxa"/>
+              <w:end w:w="120" w:type="dxa"/>
+            </w:tcMar>
+            <w:shd w:fill="EAF2F8"/>
+          </w:tcPr>
+          <w:p>
+            <w:r>
+              <w:rPr>
+                <w:rFonts w:ascii="Cascadia Mono" w:hAnsi="Cascadia Mono" w:eastAsia="Cascadia Mono"/>
+                <w:b/>
+                <w:color w:val="1F4E79"/>
+                <w:sz w:val="17"/>
+              </w:rPr>
+              <w:t>/coins ...</w:t>
+            </w:r>
+          </w:p>
+        </w:tc>
+        <w:tc>
+          <w:tcPr>
+            <w:tcW w:type="dxa" w:w="3240"/>
+            <w:vAlign w:val="center"/>
+            <w:tcMar>
+              <w:top w:w="110" w:type="dxa"/>
+              <w:start w:w="120" w:type="dxa"/>
+              <w:bottom w:w="110" w:type="dxa"/>
+              <w:end w:w="120" w:type="dxa"/>
+            </w:tcMar>
+            <w:shd w:fill="EAF2F8"/>
+          </w:tcPr>
+          <w:p>
+            <w:r>
+              <w:t>Кошелёк, баланс, наличные и переводы</w:t>
+            </w:r>
+          </w:p>
+        </w:tc>
+        <w:tc>
+          <w:tcPr>
+            <w:tcW w:type="dxa" w:w="2376"/>
+            <w:vAlign w:val="center"/>
+            <w:tcMar>
+              <w:top w:w="110" w:type="dxa"/>
+              <w:start w:w="120" w:type="dxa"/>
+              <w:bottom w:w="110" w:type="dxa"/>
+              <w:end w:w="120" w:type="dxa"/>
+            </w:tcMar>
+            <w:shd w:fill="EAF2F8"/>
+          </w:tcPr>
+          <w:p>
+            <w:r>
+              <w:t>Игрок на JEM dedicated SMP</w:t>
+            </w:r>
+          </w:p>
+        </w:tc>
+      </w:tr>
+      <w:tr>
+        <w:trPr>
+          <w:cantSplit/>
+        </w:trPr>
+        <w:tc>
+          <w:tcPr>
+            <w:tcW w:type="dxa" w:w="3888"/>
+            <w:vAlign w:val="center"/>
+            <w:tcMar>
+              <w:top w:w="110" w:type="dxa"/>
+              <w:start w:w="120" w:type="dxa"/>
+              <w:bottom w:w="110" w:type="dxa"/>
+              <w:end w:w="120" w:type="dxa"/>
+            </w:tcMar>
+          </w:tcPr>
+          <w:p>
+            <w:r>
+              <w:rPr>
+                <w:rFonts w:ascii="Cascadia Mono" w:hAnsi="Cascadia Mono" w:eastAsia="Cascadia Mono"/>
+                <w:b/>
+                <w:color w:val="1F4E79"/>
+                <w:sz w:val="17"/>
+              </w:rPr>
+              <w:t>/market</w:t>
+            </w:r>
+          </w:p>
+        </w:tc>
+        <w:tc>
+          <w:tcPr>
+            <w:tcW w:type="dxa" w:w="3240"/>
+            <w:vAlign w:val="center"/>
+            <w:tcMar>
+              <w:top w:w="110" w:type="dxa"/>
+              <w:start w:w="120" w:type="dxa"/>
+              <w:bottom w:w="110" w:type="dxa"/>
+              <w:end w:w="120" w:type="dxa"/>
+            </w:tcMar>
+          </w:tcPr>
+          <w:p>
+            <w:r>
+              <w:t>Нативное окно предложений Рыночного скупщика</w:t>
+            </w:r>
+          </w:p>
+        </w:tc>
+        <w:tc>
+          <w:tcPr>
+            <w:tcW w:type="dxa" w:w="2376"/>
+            <w:vAlign w:val="center"/>
+            <w:tcMar>
+              <w:top w:w="110" w:type="dxa"/>
+              <w:start w:w="120" w:type="dxa"/>
+              <w:bottom w:w="110" w:type="dxa"/>
+              <w:end w:w="120" w:type="dxa"/>
+            </w:tcMar>
+          </w:tcPr>
+          <w:p>
+            <w:r>
+              <w:t>Игрок на JEM dedicated SMP</w:t>
+            </w:r>
+          </w:p>
+        </w:tc>
+      </w:tr>
+      <w:tr>
+        <w:trPr>
+          <w:cantSplit/>
+        </w:trPr>
+        <w:tc>
+          <w:tcPr>
+            <w:tcW w:type="dxa" w:w="3888"/>
+            <w:vAlign w:val="center"/>
+            <w:tcMar>
+              <w:top w:w="110" w:type="dxa"/>
+              <w:start w:w="120" w:type="dxa"/>
+              <w:bottom w:w="110" w:type="dxa"/>
+              <w:end w:w="120" w:type="dxa"/>
+            </w:tcMar>
+            <w:shd w:fill="EAF2F8"/>
+          </w:tcPr>
+          <w:p>
+            <w:r>
+              <w:rPr>
+                <w:rFonts w:ascii="Cascadia Mono" w:hAnsi="Cascadia Mono" w:eastAsia="Cascadia Mono"/>
+                <w:b/>
+                <w:color w:val="1F4E79"/>
+                <w:sz w:val="17"/>
+              </w:rPr>
+              <w:t>/claims</w:t>
+            </w:r>
+          </w:p>
+        </w:tc>
+        <w:tc>
+          <w:tcPr>
+            <w:tcW w:type="dxa" w:w="3240"/>
+            <w:vAlign w:val="center"/>
+            <w:tcMar>
+              <w:top w:w="110" w:type="dxa"/>
+              <w:start w:w="120" w:type="dxa"/>
+              <w:bottom w:w="110" w:type="dxa"/>
+              <w:end w:w="120" w:type="dxa"/>
+            </w:tcMar>
+            <w:shd w:fill="EAF2F8"/>
+          </w:tcPr>
+          <w:p>
+            <w:r>
+              <w:t>Управление территориями JEM поверх Flan</w:t>
+            </w:r>
+          </w:p>
+        </w:tc>
+        <w:tc>
+          <w:tcPr>
+            <w:tcW w:type="dxa" w:w="2376"/>
+            <w:vAlign w:val="center"/>
+            <w:tcMar>
+              <w:top w:w="110" w:type="dxa"/>
+              <w:start w:w="120" w:type="dxa"/>
+              <w:bottom w:w="110" w:type="dxa"/>
+              <w:end w:w="120" w:type="dxa"/>
+            </w:tcMar>
+            <w:shd w:fill="EAF2F8"/>
+          </w:tcPr>
+          <w:p>
+            <w:r>
+              <w:t>Игрок; отдельного permission нет</w:t>
+            </w:r>
+          </w:p>
+        </w:tc>
+      </w:tr>
+      <w:tr>
+        <w:trPr>
+          <w:cantSplit/>
+        </w:trPr>
+        <w:tc>
+          <w:tcPr>
+            <w:tcW w:type="dxa" w:w="3888"/>
+            <w:vAlign w:val="center"/>
+            <w:tcMar>
+              <w:top w:w="110" w:type="dxa"/>
+              <w:start w:w="120" w:type="dxa"/>
+              <w:bottom w:w="110" w:type="dxa"/>
+              <w:end w:w="120" w:type="dxa"/>
+            </w:tcMar>
+          </w:tcPr>
+          <w:p>
+            <w:r>
+              <w:rPr>
+                <w:rFonts w:ascii="Cascadia Mono" w:hAnsi="Cascadia Mono" w:eastAsia="Cascadia Mono"/>
+                <w:b/>
+                <w:color w:val="1F4E79"/>
+                <w:sz w:val="17"/>
+              </w:rPr>
+              <w:t>/death, /deaths</w:t>
+            </w:r>
+          </w:p>
+        </w:tc>
+        <w:tc>
+          <w:tcPr>
+            <w:tcW w:type="dxa" w:w="3240"/>
+            <w:vAlign w:val="center"/>
+            <w:tcMar>
+              <w:top w:w="110" w:type="dxa"/>
+              <w:start w:w="120" w:type="dxa"/>
+              <w:bottom w:w="110" w:type="dxa"/>
+              <w:end w:w="120" w:type="dxa"/>
+            </w:tcMar>
+          </w:tcPr>
+          <w:p>
+            <w:r>
+              <w:t>История смертей и безопасный возврат</w:t>
+            </w:r>
+          </w:p>
+        </w:tc>
+        <w:tc>
+          <w:tcPr>
+            <w:tcW w:type="dxa" w:w="2376"/>
+            <w:vAlign w:val="center"/>
+            <w:tcMar>
+              <w:top w:w="110" w:type="dxa"/>
+              <w:start w:w="120" w:type="dxa"/>
+              <w:bottom w:w="110" w:type="dxa"/>
+              <w:end w:w="120" w:type="dxa"/>
+            </w:tcMar>
+          </w:tcPr>
+          <w:p>
+            <w:r>
+              <w:t>Игрок на JEM dedicated server</w:t>
+            </w:r>
+          </w:p>
+        </w:tc>
+      </w:tr>
+      <w:tr>
+        <w:trPr>
+          <w:cantSplit/>
+        </w:trPr>
+        <w:tc>
+          <w:tcPr>
+            <w:tcW w:type="dxa" w:w="3888"/>
+            <w:vAlign w:val="center"/>
+            <w:tcMar>
+              <w:top w:w="110" w:type="dxa"/>
+              <w:start w:w="120" w:type="dxa"/>
+              <w:bottom w:w="110" w:type="dxa"/>
+              <w:end w:w="120" w:type="dxa"/>
+            </w:tcMar>
+            <w:shd w:fill="EAF2F8"/>
+          </w:tcPr>
+          <w:p>
+            <w:r>
+              <w:rPr>
+                <w:rFonts w:ascii="Cascadia Mono" w:hAnsi="Cascadia Mono" w:eastAsia="Cascadia Mono"/>
+                <w:b/>
+                <w:color w:val="1F4E79"/>
+                <w:sz w:val="17"/>
+              </w:rPr>
+              <w:t>/sleep agree|disagree</w:t>
+            </w:r>
+          </w:p>
+        </w:tc>
+        <w:tc>
+          <w:tcPr>
+            <w:tcW w:type="dxa" w:w="3240"/>
+            <w:vAlign w:val="center"/>
+            <w:tcMar>
+              <w:top w:w="110" w:type="dxa"/>
+              <w:start w:w="120" w:type="dxa"/>
+              <w:bottom w:w="110" w:type="dxa"/>
+              <w:end w:w="120" w:type="dxa"/>
+            </w:tcMar>
+            <w:shd w:fill="EAF2F8"/>
+          </w:tcPr>
+          <w:p>
+            <w:r>
+              <w:t>Голосование за пропуск ночи</w:t>
+            </w:r>
+          </w:p>
+        </w:tc>
+        <w:tc>
+          <w:tcPr>
+            <w:tcW w:type="dxa" w:w="2376"/>
+            <w:vAlign w:val="center"/>
+            <w:tcMar>
+              <w:top w:w="110" w:type="dxa"/>
+              <w:start w:w="120" w:type="dxa"/>
+              <w:bottom w:w="110" w:type="dxa"/>
+              <w:end w:w="120" w:type="dxa"/>
+            </w:tcMar>
+            <w:shd w:fill="EAF2F8"/>
+          </w:tcPr>
+          <w:p>
+            <w:r>
+              <w:t>Участник активного голосования</w:t>
+            </w:r>
+          </w:p>
+        </w:tc>
+      </w:tr>
+      <w:tr>
+        <w:trPr>
+          <w:cantSplit/>
+        </w:trPr>
+        <w:tc>
+          <w:tcPr>
+            <w:tcW w:type="dxa" w:w="3888"/>
+            <w:vAlign w:val="center"/>
+            <w:tcMar>
+              <w:top w:w="110" w:type="dxa"/>
+              <w:start w:w="120" w:type="dxa"/>
+              <w:bottom w:w="110" w:type="dxa"/>
+              <w:end w:w="120" w:type="dxa"/>
+            </w:tcMar>
+          </w:tcPr>
+          <w:p>
+            <w:r>
+              <w:rPr>
+                <w:rFonts w:ascii="Cascadia Mono" w:hAnsi="Cascadia Mono" w:eastAsia="Cascadia Mono"/>
+                <w:b/>
+                <w:color w:val="1F4E79"/>
+                <w:sz w:val="17"/>
+              </w:rPr>
+              <w:t>/home</w:t>
+            </w:r>
+          </w:p>
+        </w:tc>
+        <w:tc>
+          <w:tcPr>
+            <w:tcW w:type="dxa" w:w="3240"/>
+            <w:vAlign w:val="center"/>
+            <w:tcMar>
+              <w:top w:w="110" w:type="dxa"/>
+              <w:start w:w="120" w:type="dxa"/>
+              <w:bottom w:w="110" w:type="dxa"/>
+              <w:end w:w="120" w:type="dxa"/>
+            </w:tcMar>
+          </w:tcPr>
+          <w:p>
+            <w:r>
+              <w:t>Безопасный возврат к точке возрождения</w:t>
+            </w:r>
+          </w:p>
+        </w:tc>
+        <w:tc>
+          <w:tcPr>
+            <w:tcW w:type="dxa" w:w="2376"/>
+            <w:vAlign w:val="center"/>
+            <w:tcMar>
+              <w:top w:w="110" w:type="dxa"/>
+              <w:start w:w="120" w:type="dxa"/>
+              <w:bottom w:w="110" w:type="dxa"/>
+              <w:end w:w="120" w:type="dxa"/>
+            </w:tcMar>
+          </w:tcPr>
+          <w:p>
+            <w:r>
+              <w:t>Аутентифицированный живой игрок</w:t>
+            </w:r>
+          </w:p>
+        </w:tc>
+      </w:tr>
+      <w:tr>
+        <w:trPr>
+          <w:cantSplit/>
+        </w:trPr>
+        <w:tc>
+          <w:tcPr>
+            <w:tcW w:type="dxa" w:w="3888"/>
+            <w:vAlign w:val="center"/>
+            <w:tcMar>
+              <w:top w:w="110" w:type="dxa"/>
+              <w:start w:w="120" w:type="dxa"/>
+              <w:bottom w:w="110" w:type="dxa"/>
+              <w:end w:w="120" w:type="dxa"/>
+            </w:tcMar>
+            <w:shd w:fill="EAF2F8"/>
+          </w:tcPr>
+          <w:p>
+            <w:r>
+              <w:rPr>
+                <w:rFonts w:ascii="Cascadia Mono" w:hAnsi="Cascadia Mono" w:eastAsia="Cascadia Mono"/>
+                <w:b/>
+                <w:color w:val="1F4E79"/>
+                <w:sz w:val="17"/>
+              </w:rPr>
+              <w:t>/landmarks ...</w:t>
+            </w:r>
+          </w:p>
+        </w:tc>
+        <w:tc>
+          <w:tcPr>
+            <w:tcW w:type="dxa" w:w="3240"/>
+            <w:vAlign w:val="center"/>
+            <w:tcMar>
+              <w:top w:w="110" w:type="dxa"/>
+              <w:start w:w="120" w:type="dxa"/>
+              <w:bottom w:w="110" w:type="dxa"/>
+              <w:end w:w="120" w:type="dxa"/>
+            </w:tcMar>
+            <w:shd w:fill="EAF2F8"/>
+          </w:tcPr>
+          <w:p>
+            <w:r>
+              <w:t>Общие ориентиры и их управление</w:t>
+            </w:r>
+          </w:p>
+        </w:tc>
+        <w:tc>
+          <w:tcPr>
+            <w:tcW w:type="dxa" w:w="2376"/>
+            <w:vAlign w:val="center"/>
+            <w:tcMar>
+              <w:top w:w="110" w:type="dxa"/>
+              <w:start w:w="120" w:type="dxa"/>
+              <w:bottom w:w="110" w:type="dxa"/>
+              <w:end w:w="120" w:type="dxa"/>
+            </w:tcMar>
+            <w:shd w:fill="EAF2F8"/>
+          </w:tcPr>
+          <w:p>
+            <w:r>
+              <w:t>Игрок; admin требует permission 2</w:t>
+            </w:r>
+          </w:p>
+        </w:tc>
+      </w:tr>
+      <w:tr>
+        <w:trPr>
+          <w:cantSplit/>
+        </w:trPr>
+        <w:tc>
+          <w:tcPr>
+            <w:tcW w:type="dxa" w:w="3888"/>
+            <w:vAlign w:val="center"/>
+            <w:tcMar>
+              <w:top w:w="110" w:type="dxa"/>
+              <w:start w:w="120" w:type="dxa"/>
+              <w:bottom w:w="110" w:type="dxa"/>
+              <w:end w:w="120" w:type="dxa"/>
+            </w:tcMar>
+          </w:tcPr>
+          <w:p>
+            <w:r>
+              <w:rPr>
+                <w:rFonts w:ascii="Cascadia Mono" w:hAnsi="Cascadia Mono" w:eastAsia="Cascadia Mono"/>
+                <w:b/>
+                <w:color w:val="1F4E79"/>
+                <w:sz w:val="17"/>
+              </w:rPr>
+              <w:t>/tpa accept, /tpaccept</w:t>
+            </w:r>
+          </w:p>
+        </w:tc>
+        <w:tc>
+          <w:tcPr>
+            <w:tcW w:type="dxa" w:w="3240"/>
+            <w:vAlign w:val="center"/>
+            <w:tcMar>
+              <w:top w:w="110" w:type="dxa"/>
+              <w:start w:w="120" w:type="dxa"/>
+              <w:bottom w:w="110" w:type="dxa"/>
+              <w:end w:w="120" w:type="dxa"/>
+            </w:tcMar>
+          </w:tcPr>
+          <w:p>
+            <w:r>
+              <w:t>JEM-адаптер принятия запроса TPA</w:t>
+            </w:r>
+          </w:p>
+        </w:tc>
+        <w:tc>
+          <w:tcPr>
+            <w:tcW w:type="dxa" w:w="2376"/>
+            <w:vAlign w:val="center"/>
+            <w:tcMar>
+              <w:top w:w="110" w:type="dxa"/>
+              <w:start w:w="120" w:type="dxa"/>
+              <w:bottom w:w="110" w:type="dxa"/>
+              <w:end w:w="120" w:type="dxa"/>
+            </w:tcMar>
+          </w:tcPr>
+          <w:p>
+            <w:r>
+              <w:t>Игрок на dedicated server</w:t>
+            </w:r>
+          </w:p>
+        </w:tc>
+      </w:tr>
     </w:tbl>
     <w:p/>
     <w:p>
@@ -7159,6 +7661,1986 @@
     <w:p>
       <w:pPr>
         <w:pStyle w:val="Heading1"/>
+      </w:pPr>
+      <w:r>
+        <w:t>Другие команды модпака</w:t>
+      </w:r>
+    </w:p>
+    <w:p>
+      <w:pPr/>
+      <w:r>
+        <w:t>Эти команды зарегистрированы нашими модулями и серверными адаптерами. Раздел не повторяет команды, которые поставляются самими сторонними модами.</w:t>
+      </w:r>
+    </w:p>
+    <w:p>
+      <w:pPr>
+        <w:pStyle w:val="Heading2"/>
+      </w:pPr>
+      <w:r>
+        <w:t>Экономика</w:t>
+      </w:r>
+    </w:p>
+    <w:p>
+      <w:pPr>
+        <w:pStyle w:val="Command"/>
+        <w:keepNext/>
+      </w:pPr>
+      <w:r>
+        <w:rPr>
+          <w:rFonts w:ascii="Cascadia Mono" w:hAnsi="Cascadia Mono" w:eastAsia="Cascadia Mono"/>
+          <w:b/>
+          <w:color w:val="1F4E79"/>
+          <w:sz w:val="20"/>
+        </w:rPr>
+        <w:t>/coins</w:t>
+      </w:r>
+    </w:p>
+    <w:p>
+      <w:pPr>
+        <w:spacing w:after="100" w:line="259" w:lineRule="auto"/>
+      </w:pPr>
+      <w:r>
+        <w:rPr>
+          <w:rFonts w:ascii="Aptos" w:hAnsi="Aptos" w:eastAsia="Aptos"/>
+          <w:b/>
+          <w:color w:val="000000"/>
+          <w:sz w:val="21"/>
+        </w:rPr>
+        <w:t>Простыми словами.</w:t>
+      </w:r>
+      <w:r>
+        <w:rPr>
+          <w:rFonts w:ascii="Aptos" w:hAnsi="Aptos" w:eastAsia="Aptos"/>
+          <w:b w:val="0"/>
+          <w:color w:val="000000"/>
+          <w:sz w:val="21"/>
+        </w:rPr>
+        <w:t xml:space="preserve"> Открывает экран кошелька и состояния экономики игрока.</w:t>
+      </w:r>
+    </w:p>
+    <w:p>
+      <w:pPr>
+        <w:spacing w:after="100" w:line="259" w:lineRule="auto"/>
+      </w:pPr>
+      <w:r>
+        <w:rPr>
+          <w:rFonts w:ascii="Aptos" w:hAnsi="Aptos" w:eastAsia="Aptos"/>
+          <w:b/>
+          <w:color w:val="000000"/>
+          <w:sz w:val="21"/>
+        </w:rPr>
+        <w:t>По коду.</w:t>
+      </w:r>
+      <w:r>
+        <w:rPr>
+          <w:rFonts w:ascii="Aptos" w:hAnsi="Aptos" w:eastAsia="Aptos"/>
+          <w:b w:val="0"/>
+          <w:color w:val="000000"/>
+          <w:sz w:val="21"/>
+        </w:rPr>
+        <w:t xml:space="preserve"> CoinCommands вызывает EconomyNetwork.sendStatus(player, true). Сервер собирает состояние счёта и отправляет его клиенту с флагом открытия интерфейса.</w:t>
+      </w:r>
+    </w:p>
+    <w:p>
+      <w:pPr>
+        <w:spacing w:after="100" w:line="259" w:lineRule="auto"/>
+      </w:pPr>
+      <w:r>
+        <w:rPr>
+          <w:rFonts w:ascii="Aptos" w:hAnsi="Aptos" w:eastAsia="Aptos"/>
+          <w:b/>
+          <w:color w:val="000000"/>
+          <w:sz w:val="21"/>
+        </w:rPr>
+        <w:t>Доступ.</w:t>
+      </w:r>
+      <w:r>
+        <w:rPr>
+          <w:rFonts w:ascii="Aptos" w:hAnsi="Aptos" w:eastAsia="Aptos"/>
+          <w:b w:val="0"/>
+          <w:color w:val="000000"/>
+          <w:sz w:val="21"/>
+        </w:rPr>
+        <w:t xml:space="preserve"> Команда регистрируется только при DedicatedSmp.accepts. Нужен игрок; permission не требуется.</w:t>
+      </w:r>
+    </w:p>
+    <w:p>
+      <w:pPr>
+        <w:spacing w:after="100" w:line="259" w:lineRule="auto"/>
+      </w:pPr>
+      <w:r>
+        <w:rPr>
+          <w:rFonts w:ascii="Aptos" w:hAnsi="Aptos" w:eastAsia="Aptos"/>
+          <w:b/>
+          <w:color w:val="000000"/>
+          <w:sz w:val="21"/>
+        </w:rPr>
+        <w:t>Результат и ошибки.</w:t>
+      </w:r>
+      <w:r>
+        <w:rPr>
+          <w:rFonts w:ascii="Aptos" w:hAnsi="Aptos" w:eastAsia="Aptos"/>
+          <w:b w:val="0"/>
+          <w:color w:val="000000"/>
+          <w:sz w:val="21"/>
+        </w:rPr>
+        <w:t xml:space="preserve"> Сама команда не переводит Coins и возвращает 1. Для открытия нужен совпадающий сетевой канал JEM Economy на клиенте.</w:t>
+      </w:r>
+    </w:p>
+    <w:p>
+      <w:pPr>
+        <w:pStyle w:val="Command"/>
+        <w:keepNext/>
+      </w:pPr>
+      <w:r>
+        <w:rPr>
+          <w:rFonts w:ascii="Cascadia Mono" w:hAnsi="Cascadia Mono" w:eastAsia="Cascadia Mono"/>
+          <w:b/>
+          <w:color w:val="1F4E79"/>
+          <w:sz w:val="20"/>
+        </w:rPr>
+        <w:t>/coins balance</w:t>
+      </w:r>
+    </w:p>
+    <w:p>
+      <w:pPr>
+        <w:spacing w:after="100" w:line="259" w:lineRule="auto"/>
+      </w:pPr>
+      <w:r>
+        <w:rPr>
+          <w:rFonts w:ascii="Aptos" w:hAnsi="Aptos" w:eastAsia="Aptos"/>
+          <w:b/>
+          <w:color w:val="000000"/>
+          <w:sz w:val="21"/>
+        </w:rPr>
+        <w:t>Простыми словами.</w:t>
+      </w:r>
+      <w:r>
+        <w:rPr>
+          <w:rFonts w:ascii="Aptos" w:hAnsi="Aptos" w:eastAsia="Aptos"/>
+          <w:b w:val="0"/>
+          <w:color w:val="000000"/>
+          <w:sz w:val="21"/>
+        </w:rPr>
+        <w:t xml:space="preserve"> Показывает сумму на счёте и физические Coins в инвентаре.</w:t>
+      </w:r>
+    </w:p>
+    <w:p>
+      <w:pPr>
+        <w:spacing w:after="100" w:line="259" w:lineRule="auto"/>
+      </w:pPr>
+      <w:r>
+        <w:rPr>
+          <w:rFonts w:ascii="Aptos" w:hAnsi="Aptos" w:eastAsia="Aptos"/>
+          <w:b/>
+          <w:color w:val="000000"/>
+          <w:sz w:val="21"/>
+        </w:rPr>
+        <w:t>По коду.</w:t>
+      </w:r>
+      <w:r>
+        <w:rPr>
+          <w:rFonts w:ascii="Aptos" w:hAnsi="Aptos" w:eastAsia="Aptos"/>
+          <w:b w:val="0"/>
+          <w:color w:val="000000"/>
+          <w:sz w:val="21"/>
+        </w:rPr>
+        <w:t xml:space="preserve"> Сначала IdentityPolicy ищет JEM Identity. Затем EconomyApi.balance при необходимости выдаёт стартовые 100 Coins один раз и читает ledger. EconomyApi.heldCash отдельно считает стоимость действительных физических монет и количество неподходящих предметов.</w:t>
+      </w:r>
+    </w:p>
+    <w:p>
+      <w:pPr>
+        <w:spacing w:after="100" w:line="259" w:lineRule="auto"/>
+      </w:pPr>
+      <w:r>
+        <w:rPr>
+          <w:rFonts w:ascii="Aptos" w:hAnsi="Aptos" w:eastAsia="Aptos"/>
+          <w:b/>
+          <w:color w:val="000000"/>
+          <w:sz w:val="21"/>
+        </w:rPr>
+        <w:t>Доступ.</w:t>
+      </w:r>
+      <w:r>
+        <w:rPr>
+          <w:rFonts w:ascii="Aptos" w:hAnsi="Aptos" w:eastAsia="Aptos"/>
+          <w:b w:val="0"/>
+          <w:color w:val="000000"/>
+          <w:sz w:val="21"/>
+        </w:rPr>
+        <w:t xml:space="preserve"> Игрок на dedicated SMP; permission не требуется.</w:t>
+      </w:r>
+    </w:p>
+    <w:p>
+      <w:pPr>
+        <w:spacing w:after="100" w:line="259" w:lineRule="auto"/>
+      </w:pPr>
+      <w:r>
+        <w:rPr>
+          <w:rFonts w:ascii="Aptos" w:hAnsi="Aptos" w:eastAsia="Aptos"/>
+          <w:b/>
+          <w:color w:val="000000"/>
+          <w:sz w:val="21"/>
+        </w:rPr>
+        <w:t>Результат и ошибки.</w:t>
+      </w:r>
+      <w:r>
+        <w:rPr>
+          <w:rFonts w:ascii="Aptos" w:hAnsi="Aptos" w:eastAsia="Aptos"/>
+          <w:b w:val="0"/>
+          <w:color w:val="000000"/>
+          <w:sz w:val="21"/>
+        </w:rPr>
+        <w:t xml:space="preserve"> При отсутствии identity отправляется identity_required и код 0. При успехе выводятся balance и held, код 1; кроме возможной первоначальной выдачи счёт не меняется.</w:t>
+      </w:r>
+    </w:p>
+    <w:p>
+      <w:pPr>
+        <w:pStyle w:val="Command"/>
+        <w:keepNext/>
+      </w:pPr>
+      <w:r>
+        <w:rPr>
+          <w:rFonts w:ascii="Cascadia Mono" w:hAnsi="Cascadia Mono" w:eastAsia="Cascadia Mono"/>
+          <w:b/>
+          <w:color w:val="1F4E79"/>
+          <w:sz w:val="20"/>
+        </w:rPr>
+        <w:t>/coins withdraw &lt;amount&gt;</w:t>
+      </w:r>
+    </w:p>
+    <w:p>
+      <w:pPr>
+        <w:spacing w:after="100" w:line="259" w:lineRule="auto"/>
+      </w:pPr>
+      <w:r>
+        <w:rPr>
+          <w:rFonts w:ascii="Aptos" w:hAnsi="Aptos" w:eastAsia="Aptos"/>
+          <w:b/>
+          <w:color w:val="000000"/>
+          <w:sz w:val="21"/>
+        </w:rPr>
+        <w:t>Простыми словами.</w:t>
+      </w:r>
+      <w:r>
+        <w:rPr>
+          <w:rFonts w:ascii="Aptos" w:hAnsi="Aptos" w:eastAsia="Aptos"/>
+          <w:b w:val="0"/>
+          <w:color w:val="000000"/>
+          <w:sz w:val="21"/>
+        </w:rPr>
+        <w:t xml:space="preserve"> Снимает указанную сумму со счёта и выдаёт её физическими монетами.</w:t>
+      </w:r>
+    </w:p>
+    <w:p>
+      <w:pPr>
+        <w:spacing w:after="100" w:line="259" w:lineRule="auto"/>
+      </w:pPr>
+      <w:r>
+        <w:rPr>
+          <w:rFonts w:ascii="Aptos" w:hAnsi="Aptos" w:eastAsia="Aptos"/>
+          <w:b/>
+          <w:color w:val="000000"/>
+          <w:sz w:val="21"/>
+        </w:rPr>
+        <w:t>По коду.</w:t>
+      </w:r>
+      <w:r>
+        <w:rPr>
+          <w:rFonts w:ascii="Aptos" w:hAnsi="Aptos" w:eastAsia="Aptos"/>
+          <w:b w:val="0"/>
+          <w:color w:val="000000"/>
+          <w:sz w:val="21"/>
+        </w:rPr>
+        <w:t xml:space="preserve"> Brigadier принимает amount от 1 до 1 000 000 000. EconomyApi проверяет dedicated SMP и identity, обеспечивает стартовый баланс и передаёт уникальный requestId в PhysicalCoinService.withdraw. Сервис подбирает номиналы и проводит снятие только через серверный ledger.</w:t>
+      </w:r>
+    </w:p>
+    <w:p>
+      <w:pPr>
+        <w:spacing w:after="100" w:line="259" w:lineRule="auto"/>
+      </w:pPr>
+      <w:r>
+        <w:rPr>
+          <w:rFonts w:ascii="Aptos" w:hAnsi="Aptos" w:eastAsia="Aptos"/>
+          <w:b/>
+          <w:color w:val="000000"/>
+          <w:sz w:val="21"/>
+        </w:rPr>
+        <w:t>Доступ.</w:t>
+      </w:r>
+      <w:r>
+        <w:rPr>
+          <w:rFonts w:ascii="Aptos" w:hAnsi="Aptos" w:eastAsia="Aptos"/>
+          <w:b w:val="0"/>
+          <w:color w:val="000000"/>
+          <w:sz w:val="21"/>
+        </w:rPr>
+        <w:t xml:space="preserve"> Игрок на dedicated SMP; permission не требуется.</w:t>
+      </w:r>
+    </w:p>
+    <w:p>
+      <w:pPr>
+        <w:spacing w:after="100" w:line="259" w:lineRule="auto"/>
+      </w:pPr>
+      <w:r>
+        <w:rPr>
+          <w:rFonts w:ascii="Aptos" w:hAnsi="Aptos" w:eastAsia="Aptos"/>
+          <w:b/>
+          <w:color w:val="000000"/>
+          <w:sz w:val="21"/>
+        </w:rPr>
+        <w:t>Результат и ошибки.</w:t>
+      </w:r>
+      <w:r>
+        <w:rPr>
+          <w:rFonts w:ascii="Aptos" w:hAnsi="Aptos" w:eastAsia="Aptos"/>
+          <w:b w:val="0"/>
+          <w:color w:val="000000"/>
+          <w:sz w:val="21"/>
+        </w:rPr>
+        <w:t xml:space="preserve"> Только COMMITTED возвращает 1 и сообщает сумму с разбивкой по номиналам. Недостаток средств, отсутствие места, отсутствие identity, карантин физических Coins и прочая недействительная операция возвращают 0 с отдельным сообщением; частичная выдача не считается успехом.</w:t>
+      </w:r>
+    </w:p>
+    <w:p>
+      <w:pPr>
+        <w:pStyle w:val="Command"/>
+        <w:keepNext/>
+      </w:pPr>
+      <w:r>
+        <w:rPr>
+          <w:rFonts w:ascii="Cascadia Mono" w:hAnsi="Cascadia Mono" w:eastAsia="Cascadia Mono"/>
+          <w:b/>
+          <w:color w:val="1F4E79"/>
+          <w:sz w:val="20"/>
+        </w:rPr>
+        <w:t>/coins deposit</w:t>
+      </w:r>
+    </w:p>
+    <w:p>
+      <w:pPr>
+        <w:spacing w:after="100" w:line="259" w:lineRule="auto"/>
+      </w:pPr>
+      <w:r>
+        <w:rPr>
+          <w:rFonts w:ascii="Aptos" w:hAnsi="Aptos" w:eastAsia="Aptos"/>
+          <w:b/>
+          <w:color w:val="000000"/>
+          <w:sz w:val="21"/>
+        </w:rPr>
+        <w:t>Простыми словами.</w:t>
+      </w:r>
+      <w:r>
+        <w:rPr>
+          <w:rFonts w:ascii="Aptos" w:hAnsi="Aptos" w:eastAsia="Aptos"/>
+          <w:b w:val="0"/>
+          <w:color w:val="000000"/>
+          <w:sz w:val="21"/>
+        </w:rPr>
+        <w:t xml:space="preserve"> Зачисляет на счёт все действительные физические Coins из инвентаря.</w:t>
+      </w:r>
+    </w:p>
+    <w:p>
+      <w:pPr>
+        <w:spacing w:after="100" w:line="259" w:lineRule="auto"/>
+      </w:pPr>
+      <w:r>
+        <w:rPr>
+          <w:rFonts w:ascii="Aptos" w:hAnsi="Aptos" w:eastAsia="Aptos"/>
+          <w:b/>
+          <w:color w:val="000000"/>
+          <w:sz w:val="21"/>
+        </w:rPr>
+        <w:t>По коду.</w:t>
+      </w:r>
+      <w:r>
+        <w:rPr>
+          <w:rFonts w:ascii="Aptos" w:hAnsi="Aptos" w:eastAsia="Aptos"/>
+          <w:b w:val="0"/>
+          <w:color w:val="000000"/>
+          <w:sz w:val="21"/>
+        </w:rPr>
+        <w:t xml:space="preserve"> EconomyApi.depositAll передаёт уникальный requestId в PhysicalCoinService. Сервис проверяет JEM-монеты, снимает принятые предметы и отражает ту же стоимость в ledger; число отклонённых предметов сообщается отдельно.</w:t>
+      </w:r>
+    </w:p>
+    <w:p>
+      <w:pPr>
+        <w:spacing w:after="100" w:line="259" w:lineRule="auto"/>
+      </w:pPr>
+      <w:r>
+        <w:rPr>
+          <w:rFonts w:ascii="Aptos" w:hAnsi="Aptos" w:eastAsia="Aptos"/>
+          <w:b/>
+          <w:color w:val="000000"/>
+          <w:sz w:val="21"/>
+        </w:rPr>
+        <w:t>Доступ.</w:t>
+      </w:r>
+      <w:r>
+        <w:rPr>
+          <w:rFonts w:ascii="Aptos" w:hAnsi="Aptos" w:eastAsia="Aptos"/>
+          <w:b w:val="0"/>
+          <w:color w:val="000000"/>
+          <w:sz w:val="21"/>
+        </w:rPr>
+        <w:t xml:space="preserve"> Игрок на dedicated SMP; permission не требуется.</w:t>
+      </w:r>
+    </w:p>
+    <w:p>
+      <w:pPr>
+        <w:spacing w:after="100" w:line="259" w:lineRule="auto"/>
+      </w:pPr>
+      <w:r>
+        <w:rPr>
+          <w:rFonts w:ascii="Aptos" w:hAnsi="Aptos" w:eastAsia="Aptos"/>
+          <w:b/>
+          <w:color w:val="000000"/>
+          <w:sz w:val="21"/>
+        </w:rPr>
+        <w:t>Результат и ошибки.</w:t>
+      </w:r>
+      <w:r>
+        <w:rPr>
+          <w:rFonts w:ascii="Aptos" w:hAnsi="Aptos" w:eastAsia="Aptos"/>
+          <w:b w:val="0"/>
+          <w:color w:val="000000"/>
+          <w:sz w:val="21"/>
+        </w:rPr>
+        <w:t xml:space="preserve"> COMMITTED возвращает 1 и сообщает сумму и число принятых предметов. Отсутствие действительных Coins, identity, изменение инвентаря во время операции, карантин или другая недействительность возвращают 0. Неподходящие предметы не зачисляются.</w:t>
+      </w:r>
+    </w:p>
+    <w:p>
+      <w:pPr>
+        <w:pStyle w:val="Command"/>
+        <w:keepNext/>
+      </w:pPr>
+      <w:r>
+        <w:rPr>
+          <w:rFonts w:ascii="Cascadia Mono" w:hAnsi="Cascadia Mono" w:eastAsia="Cascadia Mono"/>
+          <w:b/>
+          <w:color w:val="1F4E79"/>
+          <w:sz w:val="20"/>
+        </w:rPr>
+        <w:t>/coins send &lt;player&gt; &lt;amount&gt;</w:t>
+      </w:r>
+    </w:p>
+    <w:p>
+      <w:pPr>
+        <w:spacing w:after="100" w:line="259" w:lineRule="auto"/>
+      </w:pPr>
+      <w:r>
+        <w:rPr>
+          <w:rFonts w:ascii="Aptos" w:hAnsi="Aptos" w:eastAsia="Aptos"/>
+          <w:b/>
+          <w:color w:val="000000"/>
+          <w:sz w:val="21"/>
+        </w:rPr>
+        <w:t>Простыми словами.</w:t>
+      </w:r>
+      <w:r>
+        <w:rPr>
+          <w:rFonts w:ascii="Aptos" w:hAnsi="Aptos" w:eastAsia="Aptos"/>
+          <w:b w:val="0"/>
+          <w:color w:val="000000"/>
+          <w:sz w:val="21"/>
+        </w:rPr>
+        <w:t xml:space="preserve"> Переводит Coins другому игроку, который сейчас находится на сервере.</w:t>
+      </w:r>
+    </w:p>
+    <w:p>
+      <w:pPr>
+        <w:spacing w:after="100" w:line="259" w:lineRule="auto"/>
+      </w:pPr>
+      <w:r>
+        <w:rPr>
+          <w:rFonts w:ascii="Aptos" w:hAnsi="Aptos" w:eastAsia="Aptos"/>
+          <w:b/>
+          <w:color w:val="000000"/>
+          <w:sz w:val="21"/>
+        </w:rPr>
+        <w:t>По коду.</w:t>
+      </w:r>
+      <w:r>
+        <w:rPr>
+          <w:rFonts w:ascii="Aptos" w:hAnsi="Aptos" w:eastAsia="Aptos"/>
+          <w:b w:val="0"/>
+          <w:color w:val="000000"/>
+          <w:sz w:val="21"/>
+        </w:rPr>
+        <w:t xml:space="preserve"> Аргумент player разрешается как один online ServerPlayer, amount ограничен диапазоном 1–1 000 000 000. EconomyApi.send переводит сумму из accountId отправителя на UUID получателя с уникальным idempotency key.</w:t>
+      </w:r>
+    </w:p>
+    <w:p>
+      <w:pPr>
+        <w:spacing w:after="100" w:line="259" w:lineRule="auto"/>
+      </w:pPr>
+      <w:r>
+        <w:rPr>
+          <w:rFonts w:ascii="Aptos" w:hAnsi="Aptos" w:eastAsia="Aptos"/>
+          <w:b/>
+          <w:color w:val="000000"/>
+          <w:sz w:val="21"/>
+        </w:rPr>
+        <w:t>Доступ.</w:t>
+      </w:r>
+      <w:r>
+        <w:rPr>
+          <w:rFonts w:ascii="Aptos" w:hAnsi="Aptos" w:eastAsia="Aptos"/>
+          <w:b w:val="0"/>
+          <w:color w:val="000000"/>
+          <w:sz w:val="21"/>
+        </w:rPr>
+        <w:t xml:space="preserve"> Игрок на dedicated SMP; permission не требуется.</w:t>
+      </w:r>
+    </w:p>
+    <w:p>
+      <w:pPr>
+        <w:spacing w:after="100" w:line="259" w:lineRule="auto"/>
+      </w:pPr>
+      <w:r>
+        <w:rPr>
+          <w:rFonts w:ascii="Aptos" w:hAnsi="Aptos" w:eastAsia="Aptos"/>
+          <w:b/>
+          <w:color w:val="000000"/>
+          <w:sz w:val="21"/>
+        </w:rPr>
+        <w:t>Результат и ошибки.</w:t>
+      </w:r>
+      <w:r>
+        <w:rPr>
+          <w:rFonts w:ascii="Aptos" w:hAnsi="Aptos" w:eastAsia="Aptos"/>
+          <w:b w:val="0"/>
+          <w:color w:val="000000"/>
+          <w:sz w:val="21"/>
+        </w:rPr>
+        <w:t xml:space="preserve"> COMMITTED возвращает 1 и отправляет сообщения обеим сторонам. Отсутствие identity, недостаточный баланс или недействительная операция возвращают 0. Brigadier отклоняет отсутствующего или неоднозначного игрока до вызова метода.</w:t>
+      </w:r>
+    </w:p>
+    <w:p>
+      <w:pPr>
+        <w:pStyle w:val="Command"/>
+        <w:keepNext/>
+      </w:pPr>
+      <w:r>
+        <w:rPr>
+          <w:rFonts w:ascii="Cascadia Mono" w:hAnsi="Cascadia Mono" w:eastAsia="Cascadia Mono"/>
+          <w:b/>
+          <w:color w:val="1F4E79"/>
+          <w:sz w:val="20"/>
+        </w:rPr>
+        <w:t>/market</w:t>
+      </w:r>
+    </w:p>
+    <w:p>
+      <w:pPr>
+        <w:spacing w:after="100" w:line="259" w:lineRule="auto"/>
+      </w:pPr>
+      <w:r>
+        <w:rPr>
+          <w:rFonts w:ascii="Aptos" w:hAnsi="Aptos" w:eastAsia="Aptos"/>
+          <w:b/>
+          <w:color w:val="000000"/>
+          <w:sz w:val="21"/>
+        </w:rPr>
+        <w:t>Простыми словами.</w:t>
+      </w:r>
+      <w:r>
+        <w:rPr>
+          <w:rFonts w:ascii="Aptos" w:hAnsi="Aptos" w:eastAsia="Aptos"/>
+          <w:b w:val="0"/>
+          <w:color w:val="000000"/>
+          <w:sz w:val="21"/>
+        </w:rPr>
+        <w:t xml:space="preserve"> Открывает нативное окно торговли с текущими предложениями Рыночного скупщика.</w:t>
+      </w:r>
+    </w:p>
+    <w:p>
+      <w:pPr>
+        <w:spacing w:after="100" w:line="259" w:lineRule="auto"/>
+      </w:pPr>
+      <w:r>
+        <w:rPr>
+          <w:rFonts w:ascii="Aptos" w:hAnsi="Aptos" w:eastAsia="Aptos"/>
+          <w:b/>
+          <w:color w:val="000000"/>
+          <w:sz w:val="21"/>
+        </w:rPr>
+        <w:t>По коду.</w:t>
+      </w:r>
+      <w:r>
+        <w:rPr>
+          <w:rFonts w:ascii="Aptos" w:hAnsi="Aptos" w:eastAsia="Aptos"/>
+          <w:b w:val="0"/>
+          <w:color w:val="000000"/>
+          <w:sz w:val="21"/>
+        </w:rPr>
+        <w:t xml:space="preserve"> MarketRuntime.bulletin не ищет NPC и не загружает чанки. Он создаёт временного серверного Villager, помечает его как Buyer preview, строит персональные MerchantOffers через BuyerTradeOffers, назначает игрока торговцем и открывает обычный MerchantScreen.</w:t>
+      </w:r>
+    </w:p>
+    <w:p>
+      <w:pPr>
+        <w:spacing w:after="100" w:line="259" w:lineRule="auto"/>
+      </w:pPr>
+      <w:r>
+        <w:rPr>
+          <w:rFonts w:ascii="Aptos" w:hAnsi="Aptos" w:eastAsia="Aptos"/>
+          <w:b/>
+          <w:color w:val="000000"/>
+          <w:sz w:val="21"/>
+        </w:rPr>
+        <w:t>Доступ.</w:t>
+      </w:r>
+      <w:r>
+        <w:rPr>
+          <w:rFonts w:ascii="Aptos" w:hAnsi="Aptos" w:eastAsia="Aptos"/>
+          <w:b w:val="0"/>
+          <w:color w:val="000000"/>
+          <w:sz w:val="21"/>
+        </w:rPr>
+        <w:t xml:space="preserve"> Команда регистрируется только для dedicated SMP. Нужен игрок; permission не требуется.</w:t>
+      </w:r>
+    </w:p>
+    <w:p>
+      <w:pPr>
+        <w:spacing w:after="100" w:line="259" w:lineRule="auto"/>
+      </w:pPr>
+      <w:r>
+        <w:rPr>
+          <w:rFonts w:ascii="Aptos" w:hAnsi="Aptos" w:eastAsia="Aptos"/>
+          <w:b/>
+          <w:color w:val="000000"/>
+          <w:sz w:val="21"/>
+        </w:rPr>
+        <w:t>Результат и ошибки.</w:t>
+      </w:r>
+      <w:r>
+        <w:rPr>
+          <w:rFonts w:ascii="Aptos" w:hAnsi="Aptos" w:eastAsia="Aptos"/>
+          <w:b w:val="0"/>
+          <w:color w:val="000000"/>
+          <w:sz w:val="21"/>
+        </w:rPr>
+        <w:t xml:space="preserve"> При активном dedicated SMP и успешном создании preview возвращается 1. Если сервер не dedicated или Villager создать нельзя, возвращается 0 без изменения рынка. Сама команда не совершает сделку; расчёт происходит только при выборе нативного оффера.</w:t>
+      </w:r>
+    </w:p>
+    <w:p>
+      <w:pPr>
+        <w:pStyle w:val="Heading2"/>
+      </w:pPr>
+      <w:r>
+        <w:t>Территории</w:t>
+      </w:r>
+    </w:p>
+    <w:p>
+      <w:pPr>
+        <w:pStyle w:val="Command"/>
+        <w:keepNext/>
+      </w:pPr>
+      <w:r>
+        <w:rPr>
+          <w:rFonts w:ascii="Cascadia Mono" w:hAnsi="Cascadia Mono" w:eastAsia="Cascadia Mono"/>
+          <w:b/>
+          <w:color w:val="1F4E79"/>
+          <w:sz w:val="20"/>
+        </w:rPr>
+        <w:t>/claims</w:t>
+      </w:r>
+    </w:p>
+    <w:p>
+      <w:pPr>
+        <w:spacing w:after="100" w:line="259" w:lineRule="auto"/>
+      </w:pPr>
+      <w:r>
+        <w:rPr>
+          <w:rFonts w:ascii="Aptos" w:hAnsi="Aptos" w:eastAsia="Aptos"/>
+          <w:b/>
+          <w:color w:val="000000"/>
+          <w:sz w:val="21"/>
+        </w:rPr>
+        <w:t>Простыми словами.</w:t>
+      </w:r>
+      <w:r>
+        <w:rPr>
+          <w:rFonts w:ascii="Aptos" w:hAnsi="Aptos" w:eastAsia="Aptos"/>
+          <w:b w:val="0"/>
+          <w:color w:val="000000"/>
+          <w:sz w:val="21"/>
+        </w:rPr>
+        <w:t xml:space="preserve"> Открывает наше меню принадлежащих игроку территорий.</w:t>
+      </w:r>
+    </w:p>
+    <w:p>
+      <w:pPr>
+        <w:spacing w:after="100" w:line="259" w:lineRule="auto"/>
+      </w:pPr>
+      <w:r>
+        <w:rPr>
+          <w:rFonts w:ascii="Aptos" w:hAnsi="Aptos" w:eastAsia="Aptos"/>
+          <w:b/>
+          <w:color w:val="000000"/>
+          <w:sz w:val="21"/>
+        </w:rPr>
+        <w:t>По коду.</w:t>
+      </w:r>
+      <w:r>
+        <w:rPr>
+          <w:rFonts w:ascii="Aptos" w:hAnsi="Aptos" w:eastAsia="Aptos"/>
+          <w:b w:val="0"/>
+          <w:color w:val="000000"/>
+          <w:sz w:val="21"/>
+        </w:rPr>
+        <w:t xml:space="preserve"> JemClaims вызывает ClaimsMenus.overview(player, 0). Меню читает реальные Flan claims, объединяет соприкасающиеся участки в территории, показывает оставшийся лимит и claim blocks, а затем даёт переходы к разрешениям, участникам, настройкам, переименованию и удалению.</w:t>
+      </w:r>
+    </w:p>
+    <w:p>
+      <w:pPr>
+        <w:spacing w:after="100" w:line="259" w:lineRule="auto"/>
+      </w:pPr>
+      <w:r>
+        <w:rPr>
+          <w:rFonts w:ascii="Aptos" w:hAnsi="Aptos" w:eastAsia="Aptos"/>
+          <w:b/>
+          <w:color w:val="000000"/>
+          <w:sz w:val="21"/>
+        </w:rPr>
+        <w:t>Доступ.</w:t>
+      </w:r>
+      <w:r>
+        <w:rPr>
+          <w:rFonts w:ascii="Aptos" w:hAnsi="Aptos" w:eastAsia="Aptos"/>
+          <w:b w:val="0"/>
+          <w:color w:val="000000"/>
+          <w:sz w:val="21"/>
+        </w:rPr>
+        <w:t xml:space="preserve"> Нужен игрок; у корня нет permission-проверки и нет DedicatedSmp.accepts. Дальнейшие действия в меню повторно проверяют владельца или право Flan EDITPERMS.</w:t>
+      </w:r>
+    </w:p>
+    <w:p>
+      <w:pPr>
+        <w:spacing w:after="100" w:line="259" w:lineRule="auto"/>
+      </w:pPr>
+      <w:r>
+        <w:rPr>
+          <w:rFonts w:ascii="Aptos" w:hAnsi="Aptos" w:eastAsia="Aptos"/>
+          <w:b/>
+          <w:color w:val="000000"/>
+          <w:sz w:val="21"/>
+        </w:rPr>
+        <w:t>Результат и ошибки.</w:t>
+      </w:r>
+      <w:r>
+        <w:rPr>
+          <w:rFonts w:ascii="Aptos" w:hAnsi="Aptos" w:eastAsia="Aptos"/>
+          <w:b w:val="0"/>
+          <w:color w:val="000000"/>
+          <w:sz w:val="21"/>
+        </w:rPr>
+        <w:t xml:space="preserve"> Открытие возвращает 1 и само данные не меняет. Изменения возникают только после кликов в меню и выполняются через FlanBridge и ClaimsData; отказ управления закрывает меню и сообщает manage_denied.</w:t>
+      </w:r>
+    </w:p>
+    <w:p>
+      <w:pPr>
+        <w:pStyle w:val="Heading2"/>
+      </w:pPr>
+      <w:r>
+        <w:t>Смерти сон и дом</w:t>
+      </w:r>
+    </w:p>
+    <w:p>
+      <w:pPr>
+        <w:pStyle w:val="Command"/>
+        <w:keepNext/>
+      </w:pPr>
+      <w:r>
+        <w:rPr>
+          <w:rFonts w:ascii="Cascadia Mono" w:hAnsi="Cascadia Mono" w:eastAsia="Cascadia Mono"/>
+          <w:b/>
+          <w:color w:val="1F4E79"/>
+          <w:sz w:val="20"/>
+        </w:rPr>
+        <w:t>/deaths</w:t>
+      </w:r>
+    </w:p>
+    <w:p>
+      <w:pPr>
+        <w:spacing w:after="100" w:line="259" w:lineRule="auto"/>
+      </w:pPr>
+      <w:r>
+        <w:rPr>
+          <w:rFonts w:ascii="Aptos" w:hAnsi="Aptos" w:eastAsia="Aptos"/>
+          <w:b/>
+          <w:color w:val="000000"/>
+          <w:sz w:val="21"/>
+        </w:rPr>
+        <w:t>Простыми словами.</w:t>
+      </w:r>
+      <w:r>
+        <w:rPr>
+          <w:rFonts w:ascii="Aptos" w:hAnsi="Aptos" w:eastAsia="Aptos"/>
+          <w:b w:val="0"/>
+          <w:color w:val="000000"/>
+          <w:sz w:val="21"/>
+        </w:rPr>
+        <w:t xml:space="preserve"> Открывает последние записи о смертях и позволяет выбрать безопасный возврат.</w:t>
+      </w:r>
+    </w:p>
+    <w:p>
+      <w:pPr>
+        <w:spacing w:after="100" w:line="259" w:lineRule="auto"/>
+      </w:pPr>
+      <w:r>
+        <w:rPr>
+          <w:rFonts w:ascii="Aptos" w:hAnsi="Aptos" w:eastAsia="Aptos"/>
+          <w:b/>
+          <w:color w:val="000000"/>
+          <w:sz w:val="21"/>
+        </w:rPr>
+        <w:t>По коду.</w:t>
+      </w:r>
+      <w:r>
+        <w:rPr>
+          <w:rFonts w:ascii="Aptos" w:hAnsi="Aptos" w:eastAsia="Aptos"/>
+          <w:b w:val="0"/>
+          <w:color w:val="000000"/>
+          <w:sz w:val="21"/>
+        </w:rPr>
+        <w:t xml:space="preserve"> DeathHistory читает личную историю ServerData и строит меню максимум из настроенного числа записей, по умолчанию 3. Клик проверяет, что игрок жив, запись и измерение существуют, исходная и конечная позиции разрешены claims, а полная collision box помещается внутри границы мира без жидкостей и опасных блоков. Если точная точка занята, ищется ближайшая безопасная в радиусе, по умолчанию 8.</w:t>
+      </w:r>
+    </w:p>
+    <w:p>
+      <w:pPr>
+        <w:spacing w:after="100" w:line="259" w:lineRule="auto"/>
+      </w:pPr>
+      <w:r>
+        <w:rPr>
+          <w:rFonts w:ascii="Aptos" w:hAnsi="Aptos" w:eastAsia="Aptos"/>
+          <w:b/>
+          <w:color w:val="000000"/>
+          <w:sz w:val="21"/>
+        </w:rPr>
+        <w:t>Доступ.</w:t>
+      </w:r>
+      <w:r>
+        <w:rPr>
+          <w:rFonts w:ascii="Aptos" w:hAnsi="Aptos" w:eastAsia="Aptos"/>
+          <w:b w:val="0"/>
+          <w:color w:val="000000"/>
+          <w:sz w:val="21"/>
+        </w:rPr>
+        <w:t xml:space="preserve"> Игрок на dedicated JEM Server; permission не требуется.</w:t>
+      </w:r>
+    </w:p>
+    <w:p>
+      <w:pPr>
+        <w:spacing w:after="100" w:line="259" w:lineRule="auto"/>
+      </w:pPr>
+      <w:r>
+        <w:rPr>
+          <w:rFonts w:ascii="Aptos" w:hAnsi="Aptos" w:eastAsia="Aptos"/>
+          <w:b/>
+          <w:color w:val="000000"/>
+          <w:sz w:val="21"/>
+        </w:rPr>
+        <w:t>Результат и ошибки.</w:t>
+      </w:r>
+      <w:r>
+        <w:rPr>
+          <w:rFonts w:ascii="Aptos" w:hAnsi="Aptos" w:eastAsia="Aptos"/>
+          <w:b w:val="0"/>
+          <w:color w:val="000000"/>
+          <w:sz w:val="21"/>
+        </w:rPr>
+        <w:t xml:space="preserve"> Корень возвращает 1 и только открывает меню. Клик либо телепортирует с сохранёнными yaw и pitch и сбрасывает fallDistance, либо сообщает expired, dimension, claimed_location, no_safe_point или claimed_destination.</w:t>
+      </w:r>
+    </w:p>
+    <w:p>
+      <w:pPr>
+        <w:pStyle w:val="Command"/>
+        <w:keepNext/>
+      </w:pPr>
+      <w:r>
+        <w:rPr>
+          <w:rFonts w:ascii="Cascadia Mono" w:hAnsi="Cascadia Mono" w:eastAsia="Cascadia Mono"/>
+          <w:b/>
+          <w:color w:val="1F4E79"/>
+          <w:sz w:val="20"/>
+        </w:rPr>
+        <w:t>/death</w:t>
+      </w:r>
+    </w:p>
+    <w:p>
+      <w:pPr>
+        <w:spacing w:after="100" w:line="259" w:lineRule="auto"/>
+      </w:pPr>
+      <w:r>
+        <w:rPr>
+          <w:rFonts w:ascii="Aptos" w:hAnsi="Aptos" w:eastAsia="Aptos"/>
+          <w:b/>
+          <w:color w:val="000000"/>
+          <w:sz w:val="21"/>
+        </w:rPr>
+        <w:t>Простыми словами.</w:t>
+      </w:r>
+      <w:r>
+        <w:rPr>
+          <w:rFonts w:ascii="Aptos" w:hAnsi="Aptos" w:eastAsia="Aptos"/>
+          <w:b w:val="0"/>
+          <w:color w:val="000000"/>
+          <w:sz w:val="21"/>
+        </w:rPr>
+        <w:t xml:space="preserve"> Полный алиас команды /deaths.</w:t>
+      </w:r>
+    </w:p>
+    <w:p>
+      <w:pPr>
+        <w:spacing w:after="100" w:line="259" w:lineRule="auto"/>
+      </w:pPr>
+      <w:r>
+        <w:rPr>
+          <w:rFonts w:ascii="Aptos" w:hAnsi="Aptos" w:eastAsia="Aptos"/>
+          <w:b/>
+          <w:color w:val="000000"/>
+          <w:sz w:val="21"/>
+        </w:rPr>
+        <w:t>По коду.</w:t>
+      </w:r>
+      <w:r>
+        <w:rPr>
+          <w:rFonts w:ascii="Aptos" w:hAnsi="Aptos" w:eastAsia="Aptos"/>
+          <w:b w:val="0"/>
+          <w:color w:val="000000"/>
+          <w:sz w:val="21"/>
+        </w:rPr>
+        <w:t xml:space="preserve"> JemServer регистрирует death и deaths одним циклом; оба вызывают один и тот же DeathHistory.open.</w:t>
+      </w:r>
+    </w:p>
+    <w:p>
+      <w:pPr>
+        <w:spacing w:after="100" w:line="259" w:lineRule="auto"/>
+      </w:pPr>
+      <w:r>
+        <w:rPr>
+          <w:rFonts w:ascii="Aptos" w:hAnsi="Aptos" w:eastAsia="Aptos"/>
+          <w:b/>
+          <w:color w:val="000000"/>
+          <w:sz w:val="21"/>
+        </w:rPr>
+        <w:t>Доступ.</w:t>
+      </w:r>
+      <w:r>
+        <w:rPr>
+          <w:rFonts w:ascii="Aptos" w:hAnsi="Aptos" w:eastAsia="Aptos"/>
+          <w:b w:val="0"/>
+          <w:color w:val="000000"/>
+          <w:sz w:val="21"/>
+        </w:rPr>
+        <w:t xml:space="preserve"> Те же условия, что у /deaths.</w:t>
+      </w:r>
+    </w:p>
+    <w:p>
+      <w:pPr>
+        <w:spacing w:after="100" w:line="259" w:lineRule="auto"/>
+      </w:pPr>
+      <w:r>
+        <w:rPr>
+          <w:rFonts w:ascii="Aptos" w:hAnsi="Aptos" w:eastAsia="Aptos"/>
+          <w:b/>
+          <w:color w:val="000000"/>
+          <w:sz w:val="21"/>
+        </w:rPr>
+        <w:t>Результат и ошибки.</w:t>
+      </w:r>
+      <w:r>
+        <w:rPr>
+          <w:rFonts w:ascii="Aptos" w:hAnsi="Aptos" w:eastAsia="Aptos"/>
+          <w:b w:val="0"/>
+          <w:color w:val="000000"/>
+          <w:sz w:val="21"/>
+        </w:rPr>
+        <w:t xml:space="preserve"> Возвращает 1 после открытия того же меню; отдельной истории или другого поведения у алиаса нет.</w:t>
+      </w:r>
+    </w:p>
+    <w:p>
+      <w:pPr>
+        <w:pStyle w:val="Command"/>
+        <w:keepNext/>
+      </w:pPr>
+      <w:r>
+        <w:rPr>
+          <w:rFonts w:ascii="Cascadia Mono" w:hAnsi="Cascadia Mono" w:eastAsia="Cascadia Mono"/>
+          <w:b/>
+          <w:color w:val="1F4E79"/>
+          <w:sz w:val="20"/>
+        </w:rPr>
+        <w:t>/sleep agree</w:t>
+      </w:r>
+    </w:p>
+    <w:p>
+      <w:pPr>
+        <w:spacing w:after="100" w:line="259" w:lineRule="auto"/>
+      </w:pPr>
+      <w:r>
+        <w:rPr>
+          <w:rFonts w:ascii="Aptos" w:hAnsi="Aptos" w:eastAsia="Aptos"/>
+          <w:b/>
+          <w:color w:val="000000"/>
+          <w:sz w:val="21"/>
+        </w:rPr>
+        <w:t>Простыми словами.</w:t>
+      </w:r>
+      <w:r>
+        <w:rPr>
+          <w:rFonts w:ascii="Aptos" w:hAnsi="Aptos" w:eastAsia="Aptos"/>
+          <w:b w:val="0"/>
+          <w:color w:val="000000"/>
+          <w:sz w:val="21"/>
+        </w:rPr>
+        <w:t xml:space="preserve"> Отдаёт один голос за пропуск текущей ночи.</w:t>
+      </w:r>
+    </w:p>
+    <w:p>
+      <w:pPr>
+        <w:spacing w:after="100" w:line="259" w:lineRule="auto"/>
+      </w:pPr>
+      <w:r>
+        <w:rPr>
+          <w:rFonts w:ascii="Aptos" w:hAnsi="Aptos" w:eastAsia="Aptos"/>
+          <w:b/>
+          <w:color w:val="000000"/>
+          <w:sz w:val="21"/>
+        </w:rPr>
+        <w:t>По коду.</w:t>
+      </w:r>
+      <w:r>
+        <w:rPr>
+          <w:rFonts w:ascii="Aptos" w:hAnsi="Aptos" w:eastAsia="Aptos"/>
+          <w:b w:val="0"/>
+          <w:color w:val="000000"/>
+          <w:sz w:val="21"/>
+        </w:rPr>
+        <w:t xml:space="preserve"> SleepVote принимает голос только если функция включена, существует активный round, девятисекундный по умолчанию срок ещё не истёк, игрок входит в текущий набор online non-spectator и ещё не голосовал. Спящий игрок уже автоматически голосует за и не может повторить голос вручную.</w:t>
+      </w:r>
+    </w:p>
+    <w:p>
+      <w:pPr>
+        <w:spacing w:after="100" w:line="259" w:lineRule="auto"/>
+      </w:pPr>
+      <w:r>
+        <w:rPr>
+          <w:rFonts w:ascii="Aptos" w:hAnsi="Aptos" w:eastAsia="Aptos"/>
+          <w:b/>
+          <w:color w:val="000000"/>
+          <w:sz w:val="21"/>
+        </w:rPr>
+        <w:t>Доступ.</w:t>
+      </w:r>
+      <w:r>
+        <w:rPr>
+          <w:rFonts w:ascii="Aptos" w:hAnsi="Aptos" w:eastAsia="Aptos"/>
+          <w:b w:val="0"/>
+          <w:color w:val="000000"/>
+          <w:sz w:val="21"/>
+        </w:rPr>
+        <w:t xml:space="preserve"> Игрок; permission не требуется. Команда полезна только во время активного голосования.</w:t>
+      </w:r>
+    </w:p>
+    <w:p>
+      <w:pPr>
+        <w:spacing w:after="100" w:line="259" w:lineRule="auto"/>
+      </w:pPr>
+      <w:r>
+        <w:rPr>
+          <w:rFonts w:ascii="Aptos" w:hAnsi="Aptos" w:eastAsia="Aptos"/>
+          <w:b/>
+          <w:color w:val="000000"/>
+          <w:sz w:val="21"/>
+        </w:rPr>
+        <w:t>Результат и ошибки.</w:t>
+      </w:r>
+      <w:r>
+        <w:rPr>
+          <w:rFonts w:ascii="Aptos" w:hAnsi="Aptos" w:eastAsia="Aptos"/>
+          <w:b w:val="0"/>
+          <w:color w:val="000000"/>
+          <w:sz w:val="21"/>
+        </w:rPr>
+        <w:t xml:space="preserve"> Принятый голос сохраняется в памяти раунда, объявляется всему серверу и возвращает 1. Неактивный, просроченный, повторный или недопустимый голос возвращает 0. Ночь пропускается по окончании, только если голосов за больше, чем против.</w:t>
+      </w:r>
+    </w:p>
+    <w:p>
+      <w:pPr>
+        <w:pStyle w:val="Command"/>
+        <w:keepNext/>
+      </w:pPr>
+      <w:r>
+        <w:rPr>
+          <w:rFonts w:ascii="Cascadia Mono" w:hAnsi="Cascadia Mono" w:eastAsia="Cascadia Mono"/>
+          <w:b/>
+          <w:color w:val="1F4E79"/>
+          <w:sz w:val="20"/>
+        </w:rPr>
+        <w:t>/sleep disagree</w:t>
+      </w:r>
+    </w:p>
+    <w:p>
+      <w:pPr>
+        <w:spacing w:after="100" w:line="259" w:lineRule="auto"/>
+      </w:pPr>
+      <w:r>
+        <w:rPr>
+          <w:rFonts w:ascii="Aptos" w:hAnsi="Aptos" w:eastAsia="Aptos"/>
+          <w:b/>
+          <w:color w:val="000000"/>
+          <w:sz w:val="21"/>
+        </w:rPr>
+        <w:t>Простыми словами.</w:t>
+      </w:r>
+      <w:r>
+        <w:rPr>
+          <w:rFonts w:ascii="Aptos" w:hAnsi="Aptos" w:eastAsia="Aptos"/>
+          <w:b w:val="0"/>
+          <w:color w:val="000000"/>
+          <w:sz w:val="21"/>
+        </w:rPr>
+        <w:t xml:space="preserve"> Отдаёт один голос против пропуска текущей ночи.</w:t>
+      </w:r>
+    </w:p>
+    <w:p>
+      <w:pPr>
+        <w:spacing w:after="100" w:line="259" w:lineRule="auto"/>
+      </w:pPr>
+      <w:r>
+        <w:rPr>
+          <w:rFonts w:ascii="Aptos" w:hAnsi="Aptos" w:eastAsia="Aptos"/>
+          <w:b/>
+          <w:color w:val="000000"/>
+          <w:sz w:val="21"/>
+        </w:rPr>
+        <w:t>По коду.</w:t>
+      </w:r>
+      <w:r>
+        <w:rPr>
+          <w:rFonts w:ascii="Aptos" w:hAnsi="Aptos" w:eastAsia="Aptos"/>
+          <w:b w:val="0"/>
+          <w:color w:val="000000"/>
+          <w:sz w:val="21"/>
+        </w:rPr>
+        <w:t xml:space="preserve"> Проверки идентичны /sleep agree, но SleepBallot сохраняет false и публикует красное сообщение disagree.</w:t>
+      </w:r>
+    </w:p>
+    <w:p>
+      <w:pPr>
+        <w:spacing w:after="100" w:line="259" w:lineRule="auto"/>
+      </w:pPr>
+      <w:r>
+        <w:rPr>
+          <w:rFonts w:ascii="Aptos" w:hAnsi="Aptos" w:eastAsia="Aptos"/>
+          <w:b/>
+          <w:color w:val="000000"/>
+          <w:sz w:val="21"/>
+        </w:rPr>
+        <w:t>Доступ.</w:t>
+      </w:r>
+      <w:r>
+        <w:rPr>
+          <w:rFonts w:ascii="Aptos" w:hAnsi="Aptos" w:eastAsia="Aptos"/>
+          <w:b w:val="0"/>
+          <w:color w:val="000000"/>
+          <w:sz w:val="21"/>
+        </w:rPr>
+        <w:t xml:space="preserve"> Игрок; permission не требуется. Спящий игрок не может проголосовать против, потому что его голос за уже поставлен автоматически.</w:t>
+      </w:r>
+    </w:p>
+    <w:p>
+      <w:pPr>
+        <w:spacing w:after="100" w:line="259" w:lineRule="auto"/>
+      </w:pPr>
+      <w:r>
+        <w:rPr>
+          <w:rFonts w:ascii="Aptos" w:hAnsi="Aptos" w:eastAsia="Aptos"/>
+          <w:b/>
+          <w:color w:val="000000"/>
+          <w:sz w:val="21"/>
+        </w:rPr>
+        <w:t>Результат и ошибки.</w:t>
+      </w:r>
+      <w:r>
+        <w:rPr>
+          <w:rFonts w:ascii="Aptos" w:hAnsi="Aptos" w:eastAsia="Aptos"/>
+          <w:b w:val="0"/>
+          <w:color w:val="000000"/>
+          <w:sz w:val="21"/>
+        </w:rPr>
+        <w:t xml:space="preserve"> Первый допустимый голос возвращает 1. Все отклонённые случаи возвращают 0. При равенстве голосов ночь не пропускается, потому что approved требует строго больше голосов за.</w:t>
+      </w:r>
+    </w:p>
+    <w:p>
+      <w:pPr>
+        <w:pStyle w:val="Command"/>
+        <w:keepNext/>
+      </w:pPr>
+      <w:r>
+        <w:rPr>
+          <w:rFonts w:ascii="Cascadia Mono" w:hAnsi="Cascadia Mono" w:eastAsia="Cascadia Mono"/>
+          <w:b/>
+          <w:color w:val="1F4E79"/>
+          <w:sz w:val="20"/>
+        </w:rPr>
+        <w:t>/home</w:t>
+      </w:r>
+    </w:p>
+    <w:p>
+      <w:pPr>
+        <w:spacing w:after="100" w:line="259" w:lineRule="auto"/>
+      </w:pPr>
+      <w:r>
+        <w:rPr>
+          <w:rFonts w:ascii="Aptos" w:hAnsi="Aptos" w:eastAsia="Aptos"/>
+          <w:b/>
+          <w:color w:val="000000"/>
+          <w:sz w:val="21"/>
+        </w:rPr>
+        <w:t>Простыми словами.</w:t>
+      </w:r>
+      <w:r>
+        <w:rPr>
+          <w:rFonts w:ascii="Aptos" w:hAnsi="Aptos" w:eastAsia="Aptos"/>
+          <w:b w:val="0"/>
+          <w:color w:val="000000"/>
+          <w:sz w:val="21"/>
+        </w:rPr>
+        <w:t xml:space="preserve"> Безопасно возвращает игрока к его кровати, заряженному якорю возрождения или forced respawn point.</w:t>
+      </w:r>
+    </w:p>
+    <w:p>
+      <w:pPr>
+        <w:spacing w:after="100" w:line="259" w:lineRule="auto"/>
+      </w:pPr>
+      <w:r>
+        <w:rPr>
+          <w:rFonts w:ascii="Aptos" w:hAnsi="Aptos" w:eastAsia="Aptos"/>
+          <w:b/>
+          <w:color w:val="000000"/>
+          <w:sz w:val="21"/>
+        </w:rPr>
+        <w:t>По коду.</w:t>
+      </w:r>
+      <w:r>
+        <w:rPr>
+          <w:rFonts w:ascii="Aptos" w:hAnsi="Aptos" w:eastAsia="Aptos"/>
+          <w:b w:val="0"/>
+          <w:color w:val="000000"/>
+          <w:sz w:val="21"/>
+        </w:rPr>
+        <w:t xml:space="preserve"> HomeTravel требует JEM Identity, живого non-spectator, отсутствие урона последние 15 секунд, cooldown 60 секунд и отсутствие начавшегося event combat. Он проверяет точку возрождения, загружает её чанк, ищет безопасную полную collision box в радиусе 3 и пропускает цель через BossTeleportSafety.</w:t>
+      </w:r>
+    </w:p>
+    <w:p>
+      <w:pPr>
+        <w:spacing w:after="100" w:line="259" w:lineRule="auto"/>
+      </w:pPr>
+      <w:r>
+        <w:rPr>
+          <w:rFonts w:ascii="Aptos" w:hAnsi="Aptos" w:eastAsia="Aptos"/>
+          <w:b/>
+          <w:color w:val="000000"/>
+          <w:sz w:val="21"/>
+        </w:rPr>
+        <w:t>Доступ.</w:t>
+      </w:r>
+      <w:r>
+        <w:rPr>
+          <w:rFonts w:ascii="Aptos" w:hAnsi="Aptos" w:eastAsia="Aptos"/>
+          <w:b w:val="0"/>
+          <w:color w:val="000000"/>
+          <w:sz w:val="21"/>
+        </w:rPr>
+        <w:t xml:space="preserve"> Аутентифицированный игрок; permission не требуется.</w:t>
+      </w:r>
+    </w:p>
+    <w:p>
+      <w:pPr>
+        <w:spacing w:after="100" w:line="259" w:lineRule="auto"/>
+      </w:pPr>
+      <w:r>
+        <w:rPr>
+          <w:rFonts w:ascii="Aptos" w:hAnsi="Aptos" w:eastAsia="Aptos"/>
+          <w:b/>
+          <w:color w:val="000000"/>
+          <w:sz w:val="21"/>
+        </w:rPr>
+        <w:t>Результат и ошибки.</w:t>
+      </w:r>
+      <w:r>
+        <w:rPr>
+          <w:rFonts w:ascii="Aptos" w:hAnsi="Aptos" w:eastAsia="Aptos"/>
+          <w:b w:val="0"/>
+          <w:color w:val="000000"/>
+          <w:sz w:val="21"/>
+        </w:rPr>
+        <w:t xml:space="preserve"> Успех закрывает контейнер, снимает игрока с транспорта, телепортирует через общий safety owner, записывает LAST_USE и возвращает 1. identity_required, unavailable, combat, cooldown, arena, missing, invalid и unsafe возвращают 0 с action-bar сообщением.</w:t>
+      </w:r>
+    </w:p>
+    <w:p>
+      <w:pPr>
+        <w:pStyle w:val="Heading2"/>
+      </w:pPr>
+      <w:r>
+        <w:t>Ориентиры</w:t>
+      </w:r>
+    </w:p>
+    <w:p>
+      <w:pPr>
+        <w:pStyle w:val="Command"/>
+        <w:keepNext/>
+      </w:pPr>
+      <w:r>
+        <w:rPr>
+          <w:rFonts w:ascii="Cascadia Mono" w:hAnsi="Cascadia Mono" w:eastAsia="Cascadia Mono"/>
+          <w:b/>
+          <w:color w:val="1F4E79"/>
+          <w:sz w:val="20"/>
+        </w:rPr>
+        <w:t>/landmarks</w:t>
+      </w:r>
+    </w:p>
+    <w:p>
+      <w:pPr>
+        <w:spacing w:after="100" w:line="259" w:lineRule="auto"/>
+      </w:pPr>
+      <w:r>
+        <w:rPr>
+          <w:rFonts w:ascii="Aptos" w:hAnsi="Aptos" w:eastAsia="Aptos"/>
+          <w:b/>
+          <w:color w:val="000000"/>
+          <w:sz w:val="21"/>
+        </w:rPr>
+        <w:t>Простыми словами.</w:t>
+      </w:r>
+      <w:r>
+        <w:rPr>
+          <w:rFonts w:ascii="Aptos" w:hAnsi="Aptos" w:eastAsia="Aptos"/>
+          <w:b w:val="0"/>
+          <w:color w:val="000000"/>
+          <w:sz w:val="21"/>
+        </w:rPr>
+        <w:t xml:space="preserve"> Открывает список видимых игроку общих ориентиров.</w:t>
+      </w:r>
+    </w:p>
+    <w:p>
+      <w:pPr>
+        <w:spacing w:after="100" w:line="259" w:lineRule="auto"/>
+      </w:pPr>
+      <w:r>
+        <w:rPr>
+          <w:rFonts w:ascii="Aptos" w:hAnsi="Aptos" w:eastAsia="Aptos"/>
+          <w:b/>
+          <w:color w:val="000000"/>
+          <w:sz w:val="21"/>
+        </w:rPr>
+        <w:t>По коду.</w:t>
+      </w:r>
+      <w:r>
+        <w:rPr>
+          <w:rFonts w:ascii="Aptos" w:hAnsi="Aptos" w:eastAsia="Aptos"/>
+          <w:b w:val="0"/>
+          <w:color w:val="000000"/>
+          <w:sz w:val="21"/>
+        </w:rPr>
+        <w:t xml:space="preserve"> Landmarks.open читает ServerData, сортирует записи по имени и UUID, ограничивает страницу диапазоном и показывает до 45 записей. Иконки несут dimension, позицию и радиус для клиентской карты; из меню можно открыть свою запись или начать создание новой.</w:t>
+      </w:r>
+    </w:p>
+    <w:p>
+      <w:pPr>
+        <w:spacing w:after="100" w:line="259" w:lineRule="auto"/>
+      </w:pPr>
+      <w:r>
+        <w:rPr>
+          <w:rFonts w:ascii="Aptos" w:hAnsi="Aptos" w:eastAsia="Aptos"/>
+          <w:b/>
+          <w:color w:val="000000"/>
+          <w:sz w:val="21"/>
+        </w:rPr>
+        <w:t>Доступ.</w:t>
+      </w:r>
+      <w:r>
+        <w:rPr>
+          <w:rFonts w:ascii="Aptos" w:hAnsi="Aptos" w:eastAsia="Aptos"/>
+          <w:b w:val="0"/>
+          <w:color w:val="000000"/>
+          <w:sz w:val="21"/>
+        </w:rPr>
+        <w:t xml:space="preserve"> Игрок; permission не требуется. Функция должна быть включена в jem_server server config.</w:t>
+      </w:r>
+    </w:p>
+    <w:p>
+      <w:pPr>
+        <w:spacing w:after="100" w:line="259" w:lineRule="auto"/>
+      </w:pPr>
+      <w:r>
+        <w:rPr>
+          <w:rFonts w:ascii="Aptos" w:hAnsi="Aptos" w:eastAsia="Aptos"/>
+          <w:b/>
+          <w:color w:val="000000"/>
+          <w:sz w:val="21"/>
+        </w:rPr>
+        <w:t>Результат и ошибки.</w:t>
+      </w:r>
+      <w:r>
+        <w:rPr>
+          <w:rFonts w:ascii="Aptos" w:hAnsi="Aptos" w:eastAsia="Aptos"/>
+          <w:b w:val="0"/>
+          <w:color w:val="000000"/>
+          <w:sz w:val="21"/>
+        </w:rPr>
+        <w:t xml:space="preserve"> Команда возвращает 1 даже если функция выключена и метод сразу ничего не откроет. Обычное открытие данные не меняет.</w:t>
+      </w:r>
+    </w:p>
+    <w:p>
+      <w:pPr>
+        <w:pStyle w:val="Command"/>
+        <w:keepNext/>
+      </w:pPr>
+      <w:r>
+        <w:rPr>
+          <w:rFonts w:ascii="Cascadia Mono" w:hAnsi="Cascadia Mono" w:eastAsia="Cascadia Mono"/>
+          <w:b/>
+          <w:color w:val="1F4E79"/>
+          <w:sz w:val="20"/>
+        </w:rPr>
+        <w:t>/landmarks create</w:t>
+      </w:r>
+    </w:p>
+    <w:p>
+      <w:pPr>
+        <w:spacing w:after="100" w:line="259" w:lineRule="auto"/>
+      </w:pPr>
+      <w:r>
+        <w:rPr>
+          <w:rFonts w:ascii="Aptos" w:hAnsi="Aptos" w:eastAsia="Aptos"/>
+          <w:b/>
+          <w:color w:val="000000"/>
+          <w:sz w:val="21"/>
+        </w:rPr>
+        <w:t>Простыми словами.</w:t>
+      </w:r>
+      <w:r>
+        <w:rPr>
+          <w:rFonts w:ascii="Aptos" w:hAnsi="Aptos" w:eastAsia="Aptos"/>
+          <w:b w:val="0"/>
+          <w:color w:val="000000"/>
+          <w:sz w:val="21"/>
+        </w:rPr>
+        <w:t xml:space="preserve"> Начинает создание ориентира в текущей позиции игрока.</w:t>
+      </w:r>
+    </w:p>
+    <w:p>
+      <w:pPr>
+        <w:spacing w:after="100" w:line="259" w:lineRule="auto"/>
+      </w:pPr>
+      <w:r>
+        <w:rPr>
+          <w:rFonts w:ascii="Aptos" w:hAnsi="Aptos" w:eastAsia="Aptos"/>
+          <w:b/>
+          <w:color w:val="000000"/>
+          <w:sz w:val="21"/>
+        </w:rPr>
+        <w:t>По коду.</w:t>
+      </w:r>
+      <w:r>
+        <w:rPr>
+          <w:rFonts w:ascii="Aptos" w:hAnsi="Aptos" w:eastAsia="Aptos"/>
+          <w:b w:val="0"/>
+          <w:color w:val="000000"/>
+          <w:sz w:val="21"/>
+        </w:rPr>
+        <w:t xml:space="preserve"> Сначала открывается ввод имени, затем выбор категории scenery, building, landmark, shop или danger. Имя после strip должно быть непустым, не длиннее настроенного лимита, по умолчанию 48, и не содержать управляющие символы или §. Позиция должна быть в текущем измерении, внутри world border и высоты мира, а чанк должен быть доступен по claims. После публикации LandmarkNetwork рассылает изменение.</w:t>
+      </w:r>
+    </w:p>
+    <w:p>
+      <w:pPr>
+        <w:spacing w:after="100" w:line="259" w:lineRule="auto"/>
+      </w:pPr>
+      <w:r>
+        <w:rPr>
+          <w:rFonts w:ascii="Aptos" w:hAnsi="Aptos" w:eastAsia="Aptos"/>
+          <w:b/>
+          <w:color w:val="000000"/>
+          <w:sz w:val="21"/>
+        </w:rPr>
+        <w:t>Доступ.</w:t>
+      </w:r>
+      <w:r>
+        <w:rPr>
+          <w:rFonts w:ascii="Aptos" w:hAnsi="Aptos" w:eastAsia="Aptos"/>
+          <w:b w:val="0"/>
+          <w:color w:val="000000"/>
+          <w:sz w:val="21"/>
+        </w:rPr>
+        <w:t xml:space="preserve"> Игрок; permission не требуется. Функция ориентиров должна быть включена.</w:t>
+      </w:r>
+    </w:p>
+    <w:p>
+      <w:pPr>
+        <w:spacing w:after="100" w:line="259" w:lineRule="auto"/>
+      </w:pPr>
+      <w:r>
+        <w:rPr>
+          <w:rFonts w:ascii="Aptos" w:hAnsi="Aptos" w:eastAsia="Aptos"/>
+          <w:b/>
+          <w:color w:val="000000"/>
+          <w:sz w:val="21"/>
+        </w:rPr>
+        <w:t>Результат и ошибки.</w:t>
+      </w:r>
+      <w:r>
+        <w:rPr>
+          <w:rFonts w:ascii="Aptos" w:hAnsi="Aptos" w:eastAsia="Aptos"/>
+          <w:b w:val="0"/>
+          <w:color w:val="000000"/>
+          <w:sz w:val="21"/>
+        </w:rPr>
+        <w:t xml:space="preserve"> Регистрация команды возвращает 1 сразу после открытия ввода. Ошибки имени, позиции и общего лимита сообщаются позднее в UI. Полный дубль того же имени и позиции считается успешным без второй записи.</w:t>
+      </w:r>
+    </w:p>
+    <w:p>
+      <w:pPr>
+        <w:pStyle w:val="Command"/>
+        <w:keepNext/>
+      </w:pPr>
+      <w:r>
+        <w:rPr>
+          <w:rFonts w:ascii="Cascadia Mono" w:hAnsi="Cascadia Mono" w:eastAsia="Cascadia Mono"/>
+          <w:b/>
+          <w:color w:val="1F4E79"/>
+          <w:sz w:val="20"/>
+        </w:rPr>
+        <w:t>/landmarks admin</w:t>
+      </w:r>
+    </w:p>
+    <w:p>
+      <w:pPr>
+        <w:spacing w:after="100" w:line="259" w:lineRule="auto"/>
+      </w:pPr>
+      <w:r>
+        <w:rPr>
+          <w:rFonts w:ascii="Aptos" w:hAnsi="Aptos" w:eastAsia="Aptos"/>
+          <w:b/>
+          <w:color w:val="000000"/>
+          <w:sz w:val="21"/>
+        </w:rPr>
+        <w:t>Простыми словами.</w:t>
+      </w:r>
+      <w:r>
+        <w:rPr>
+          <w:rFonts w:ascii="Aptos" w:hAnsi="Aptos" w:eastAsia="Aptos"/>
+          <w:b w:val="0"/>
+          <w:color w:val="000000"/>
+          <w:sz w:val="21"/>
+        </w:rPr>
+        <w:t xml:space="preserve"> Открывает тот же список в режиме управления.</w:t>
+      </w:r>
+    </w:p>
+    <w:p>
+      <w:pPr>
+        <w:spacing w:after="100" w:line="259" w:lineRule="auto"/>
+      </w:pPr>
+      <w:r>
+        <w:rPr>
+          <w:rFonts w:ascii="Aptos" w:hAnsi="Aptos" w:eastAsia="Aptos"/>
+          <w:b/>
+          <w:color w:val="000000"/>
+          <w:sz w:val="21"/>
+        </w:rPr>
+        <w:t>По коду.</w:t>
+      </w:r>
+      <w:r>
+        <w:rPr>
+          <w:rFonts w:ascii="Aptos" w:hAnsi="Aptos" w:eastAsia="Aptos"/>
+          <w:b w:val="0"/>
+          <w:color w:val="000000"/>
+          <w:sz w:val="21"/>
+        </w:rPr>
+        <w:t xml:space="preserve"> Команда вызывает Landmarks.open(player, 0, true). Сам список остаётся персонально отфильтрованным ServerData; режим передаётся в переходы управления и дополнительно проверяется внутри open.</w:t>
+      </w:r>
+    </w:p>
+    <w:p>
+      <w:pPr>
+        <w:spacing w:after="100" w:line="259" w:lineRule="auto"/>
+      </w:pPr>
+      <w:r>
+        <w:rPr>
+          <w:rFonts w:ascii="Aptos" w:hAnsi="Aptos" w:eastAsia="Aptos"/>
+          <w:b/>
+          <w:color w:val="000000"/>
+          <w:sz w:val="21"/>
+        </w:rPr>
+        <w:t>Доступ.</w:t>
+      </w:r>
+      <w:r>
+        <w:rPr>
+          <w:rFonts w:ascii="Aptos" w:hAnsi="Aptos" w:eastAsia="Aptos"/>
+          <w:b w:val="0"/>
+          <w:color w:val="000000"/>
+          <w:sz w:val="21"/>
+        </w:rPr>
+        <w:t xml:space="preserve"> Требуется permission 2 и игрок.</w:t>
+      </w:r>
+    </w:p>
+    <w:p>
+      <w:pPr>
+        <w:spacing w:after="100" w:line="259" w:lineRule="auto"/>
+      </w:pPr>
+      <w:r>
+        <w:rPr>
+          <w:rFonts w:ascii="Aptos" w:hAnsi="Aptos" w:eastAsia="Aptos"/>
+          <w:b/>
+          <w:color w:val="000000"/>
+          <w:sz w:val="21"/>
+        </w:rPr>
+        <w:t>Результат и ошибки.</w:t>
+      </w:r>
+      <w:r>
+        <w:rPr>
+          <w:rFonts w:ascii="Aptos" w:hAnsi="Aptos" w:eastAsia="Aptos"/>
+          <w:b w:val="0"/>
+          <w:color w:val="000000"/>
+          <w:sz w:val="21"/>
+        </w:rPr>
+        <w:t xml:space="preserve"> Возвращает 1 после вызова. Если ориентиры выключены или permission исчез до открытия, метод ничего не показывает; сама команда записи не изменяет.</w:t>
+      </w:r>
+    </w:p>
+    <w:p>
+      <w:pPr>
+        <w:pStyle w:val="Command"/>
+        <w:keepNext/>
+      </w:pPr>
+      <w:r>
+        <w:rPr>
+          <w:rFonts w:ascii="Cascadia Mono" w:hAnsi="Cascadia Mono" w:eastAsia="Cascadia Mono"/>
+          <w:b/>
+          <w:color w:val="1F4E79"/>
+          <w:sz w:val="20"/>
+        </w:rPr>
+        <w:t>/landmarks remove &lt;id&gt;</w:t>
+      </w:r>
+    </w:p>
+    <w:p>
+      <w:pPr>
+        <w:spacing w:after="100" w:line="259" w:lineRule="auto"/>
+      </w:pPr>
+      <w:r>
+        <w:rPr>
+          <w:rFonts w:ascii="Aptos" w:hAnsi="Aptos" w:eastAsia="Aptos"/>
+          <w:b/>
+          <w:color w:val="000000"/>
+          <w:sz w:val="21"/>
+        </w:rPr>
+        <w:t>Простыми словами.</w:t>
+      </w:r>
+      <w:r>
+        <w:rPr>
+          <w:rFonts w:ascii="Aptos" w:hAnsi="Aptos" w:eastAsia="Aptos"/>
+          <w:b w:val="0"/>
+          <w:color w:val="000000"/>
+          <w:sz w:val="21"/>
+        </w:rPr>
+        <w:t xml:space="preserve"> Удаляет собственный обычный ориентир по UUID.</w:t>
+      </w:r>
+    </w:p>
+    <w:p>
+      <w:pPr>
+        <w:spacing w:after="100" w:line="259" w:lineRule="auto"/>
+      </w:pPr>
+      <w:r>
+        <w:rPr>
+          <w:rFonts w:ascii="Aptos" w:hAnsi="Aptos" w:eastAsia="Aptos"/>
+          <w:b/>
+          <w:color w:val="000000"/>
+          <w:sz w:val="21"/>
+        </w:rPr>
+        <w:t>По коду.</w:t>
+      </w:r>
+      <w:r>
+        <w:rPr>
+          <w:rFonts w:ascii="Aptos" w:hAnsi="Aptos" w:eastAsia="Aptos"/>
+          <w:b w:val="0"/>
+          <w:color w:val="000000"/>
+          <w:sz w:val="21"/>
+        </w:rPr>
+        <w:t xml:space="preserve"> UuidArgument разбирает id. Landmarks.delete разрешает удаление только создателю, запрещает системные boss landmarks, удаляет запись из ServerData и отправляет LandmarkNetwork.removed; затем снова открывается обычный список.</w:t>
+      </w:r>
+    </w:p>
+    <w:p>
+      <w:pPr>
+        <w:spacing w:after="100" w:line="259" w:lineRule="auto"/>
+      </w:pPr>
+      <w:r>
+        <w:rPr>
+          <w:rFonts w:ascii="Aptos" w:hAnsi="Aptos" w:eastAsia="Aptos"/>
+          <w:b/>
+          <w:color w:val="000000"/>
+          <w:sz w:val="21"/>
+        </w:rPr>
+        <w:t>Доступ.</w:t>
+      </w:r>
+      <w:r>
+        <w:rPr>
+          <w:rFonts w:ascii="Aptos" w:hAnsi="Aptos" w:eastAsia="Aptos"/>
+          <w:b w:val="0"/>
+          <w:color w:val="000000"/>
+          <w:sz w:val="21"/>
+        </w:rPr>
+        <w:t xml:space="preserve"> Игрок; отдельный permission не нужен, но запись должна принадлежать этому игроку.</w:t>
+      </w:r>
+    </w:p>
+    <w:p>
+      <w:pPr>
+        <w:spacing w:after="100" w:line="259" w:lineRule="auto"/>
+      </w:pPr>
+      <w:r>
+        <w:rPr>
+          <w:rFonts w:ascii="Aptos" w:hAnsi="Aptos" w:eastAsia="Aptos"/>
+          <w:b/>
+          <w:color w:val="000000"/>
+          <w:sz w:val="21"/>
+        </w:rPr>
+        <w:t>Результат и ошибки.</w:t>
+      </w:r>
+      <w:r>
+        <w:rPr>
+          <w:rFonts w:ascii="Aptos" w:hAnsi="Aptos" w:eastAsia="Aptos"/>
+          <w:b w:val="0"/>
+          <w:color w:val="000000"/>
+          <w:sz w:val="21"/>
+        </w:rPr>
+        <w:t xml:space="preserve"> Успешное удаление возвращает 1 и сообщает deleted. Выключенная функция, отсутствующий UUID, чужая или системная запись возвращает 0; already_deleted используется, если разрешённая запись не изменила данные при удалении.</w:t>
+      </w:r>
+    </w:p>
+    <w:p>
+      <w:pPr>
+        <w:pStyle w:val="Heading2"/>
+      </w:pPr>
+      <w:r>
+        <w:t>Совместимость с TPA</w:t>
+      </w:r>
+    </w:p>
+    <w:p>
+      <w:pPr>
+        <w:pStyle w:val="Command"/>
+        <w:keepNext/>
+      </w:pPr>
+      <w:r>
+        <w:rPr>
+          <w:rFonts w:ascii="Cascadia Mono" w:hAnsi="Cascadia Mono" w:eastAsia="Cascadia Mono"/>
+          <w:b/>
+          <w:color w:val="1F4E79"/>
+          <w:sz w:val="20"/>
+        </w:rPr>
+        <w:t>/tpa accept</w:t>
+      </w:r>
+    </w:p>
+    <w:p>
+      <w:pPr>
+        <w:spacing w:after="100" w:line="259" w:lineRule="auto"/>
+      </w:pPr>
+      <w:r>
+        <w:rPr>
+          <w:rFonts w:ascii="Aptos" w:hAnsi="Aptos" w:eastAsia="Aptos"/>
+          <w:b/>
+          <w:color w:val="000000"/>
+          <w:sz w:val="21"/>
+        </w:rPr>
+        <w:t>Простыми словами.</w:t>
+      </w:r>
+      <w:r>
+        <w:rPr>
+          <w:rFonts w:ascii="Aptos" w:hAnsi="Aptos" w:eastAsia="Aptos"/>
+          <w:b w:val="0"/>
+          <w:color w:val="000000"/>
+          <w:sz w:val="21"/>
+        </w:rPr>
+        <w:t xml:space="preserve"> Принимает входящий запрос TPA через наш безопасный адаптер.</w:t>
+      </w:r>
+    </w:p>
+    <w:p>
+      <w:pPr>
+        <w:spacing w:after="100" w:line="259" w:lineRule="auto"/>
+      </w:pPr>
+      <w:r>
+        <w:rPr>
+          <w:rFonts w:ascii="Aptos" w:hAnsi="Aptos" w:eastAsia="Aptos"/>
+          <w:b/>
+          <w:color w:val="000000"/>
+          <w:sz w:val="21"/>
+        </w:rPr>
+        <w:t>По коду.</w:t>
+      </w:r>
+      <w:r>
+        <w:rPr>
+          <w:rFonts w:ascii="Aptos" w:hAnsi="Aptos" w:eastAsia="Aptos"/>
+          <w:b w:val="0"/>
+          <w:color w:val="000000"/>
+          <w:sz w:val="21"/>
+        </w:rPr>
+        <w:t xml:space="preserve"> TpaCompat сначала просматривает config/TPA/data только для текущего receiver и удаляет его запросы, если срок истёк или sender уже offline. После очистки он рефлексивно вызывает TpaManager.acceptRequest у установленного TPA-мода; сам JEM не воспроизводит его телепортацию.</w:t>
+      </w:r>
+    </w:p>
+    <w:p>
+      <w:pPr>
+        <w:spacing w:after="100" w:line="259" w:lineRule="auto"/>
+      </w:pPr>
+      <w:r>
+        <w:rPr>
+          <w:rFonts w:ascii="Aptos" w:hAnsi="Aptos" w:eastAsia="Aptos"/>
+          <w:b/>
+          <w:color w:val="000000"/>
+          <w:sz w:val="21"/>
+        </w:rPr>
+        <w:t>Доступ.</w:t>
+      </w:r>
+      <w:r>
+        <w:rPr>
+          <w:rFonts w:ascii="Aptos" w:hAnsi="Aptos" w:eastAsia="Aptos"/>
+          <w:b w:val="0"/>
+          <w:color w:val="000000"/>
+          <w:sz w:val="21"/>
+        </w:rPr>
+        <w:t xml:space="preserve"> Только dedicated server, нужен игрок; permission не требуется.</w:t>
+      </w:r>
+    </w:p>
+    <w:p>
+      <w:pPr>
+        <w:spacing w:after="100" w:line="259" w:lineRule="auto"/>
+      </w:pPr>
+      <w:r>
+        <w:rPr>
+          <w:rFonts w:ascii="Aptos" w:hAnsi="Aptos" w:eastAsia="Aptos"/>
+          <w:b/>
+          <w:color w:val="000000"/>
+          <w:sz w:val="21"/>
+        </w:rPr>
+        <w:t>Результат и ошибки.</w:t>
+      </w:r>
+      <w:r>
+        <w:rPr>
+          <w:rFonts w:ascii="Aptos" w:hAnsi="Aptos" w:eastAsia="Aptos"/>
+          <w:b w:val="0"/>
+          <w:color w:val="000000"/>
+          <w:sz w:val="21"/>
+        </w:rPr>
+        <w:t xml:space="preserve"> При обычном вызове возвращается Brigadier SINGLE_SUCCESS. Итог запроса и сообщения принадлежат TPA-моду. Отсутствие ожидаемого класса или метода, а также ошибка чтения данных превращаются в IllegalStateException вместо скрытого fallback.</w:t>
+      </w:r>
+    </w:p>
+    <w:p>
+      <w:pPr>
+        <w:pStyle w:val="Command"/>
+        <w:keepNext/>
+      </w:pPr>
+      <w:r>
+        <w:rPr>
+          <w:rFonts w:ascii="Cascadia Mono" w:hAnsi="Cascadia Mono" w:eastAsia="Cascadia Mono"/>
+          <w:b/>
+          <w:color w:val="1F4E79"/>
+          <w:sz w:val="20"/>
+        </w:rPr>
+        <w:t>/tpaccept</w:t>
+      </w:r>
+    </w:p>
+    <w:p>
+      <w:pPr>
+        <w:spacing w:after="100" w:line="259" w:lineRule="auto"/>
+      </w:pPr>
+      <w:r>
+        <w:rPr>
+          <w:rFonts w:ascii="Aptos" w:hAnsi="Aptos" w:eastAsia="Aptos"/>
+          <w:b/>
+          <w:color w:val="000000"/>
+          <w:sz w:val="21"/>
+        </w:rPr>
+        <w:t>Простыми словами.</w:t>
+      </w:r>
+      <w:r>
+        <w:rPr>
+          <w:rFonts w:ascii="Aptos" w:hAnsi="Aptos" w:eastAsia="Aptos"/>
+          <w:b w:val="0"/>
+          <w:color w:val="000000"/>
+          <w:sz w:val="21"/>
+        </w:rPr>
+        <w:t xml:space="preserve"> Короткий алиас нашего /tpa accept.</w:t>
+      </w:r>
+    </w:p>
+    <w:p>
+      <w:pPr>
+        <w:spacing w:after="100" w:line="259" w:lineRule="auto"/>
+      </w:pPr>
+      <w:r>
+        <w:rPr>
+          <w:rFonts w:ascii="Aptos" w:hAnsi="Aptos" w:eastAsia="Aptos"/>
+          <w:b/>
+          <w:color w:val="000000"/>
+          <w:sz w:val="21"/>
+        </w:rPr>
+        <w:t>По коду.</w:t>
+      </w:r>
+      <w:r>
+        <w:rPr>
+          <w:rFonts w:ascii="Aptos" w:hAnsi="Aptos" w:eastAsia="Aptos"/>
+          <w:b w:val="0"/>
+          <w:color w:val="000000"/>
+          <w:sz w:val="21"/>
+        </w:rPr>
+        <w:t xml:space="preserve"> Команда вызывает тот же TpaCompat.accept, включая очистку просроченных или оставшихся без online sender файлов перед передачей TPA-моду.</w:t>
+      </w:r>
+    </w:p>
+    <w:p>
+      <w:pPr>
+        <w:spacing w:after="100" w:line="259" w:lineRule="auto"/>
+      </w:pPr>
+      <w:r>
+        <w:rPr>
+          <w:rFonts w:ascii="Aptos" w:hAnsi="Aptos" w:eastAsia="Aptos"/>
+          <w:b/>
+          <w:color w:val="000000"/>
+          <w:sz w:val="21"/>
+        </w:rPr>
+        <w:t>Доступ.</w:t>
+      </w:r>
+      <w:r>
+        <w:rPr>
+          <w:rFonts w:ascii="Aptos" w:hAnsi="Aptos" w:eastAsia="Aptos"/>
+          <w:b w:val="0"/>
+          <w:color w:val="000000"/>
+          <w:sz w:val="21"/>
+        </w:rPr>
+        <w:t xml:space="preserve"> Только dedicated server, нужен игрок; permission не требуется.</w:t>
+      </w:r>
+    </w:p>
+    <w:p>
+      <w:pPr>
+        <w:spacing w:after="100" w:line="259" w:lineRule="auto"/>
+      </w:pPr>
+      <w:r>
+        <w:rPr>
+          <w:rFonts w:ascii="Aptos" w:hAnsi="Aptos" w:eastAsia="Aptos"/>
+          <w:b/>
+          <w:color w:val="000000"/>
+          <w:sz w:val="21"/>
+        </w:rPr>
+        <w:t>Результат и ошибки.</w:t>
+      </w:r>
+      <w:r>
+        <w:rPr>
+          <w:rFonts w:ascii="Aptos" w:hAnsi="Aptos" w:eastAsia="Aptos"/>
+          <w:b w:val="0"/>
+          <w:color w:val="000000"/>
+          <w:sz w:val="21"/>
+        </w:rPr>
+        <w:t xml:space="preserve"> Возвращаемое значение и ошибки полностью совпадают с /tpa accept; отдельной логики телепортации у алиаса нет.</w:t>
+      </w:r>
+    </w:p>
+    <w:p>
+      <w:pPr>
+        <w:pStyle w:val="Heading1"/>
         <w:keepNext/>
       </w:pPr>
       <w:r>
@@ -7302,6 +9784,30 @@
     </w:p>
     <w:p>
       <w:pPr>
+        <w:pStyle w:val="ListBullet"/>
+      </w:pPr>
+      <w:r>
+        <w:t>/coins и /market регистрируются через DedicatedSmp.accepts; в integrated server этих корней нет.</w:t>
+      </w:r>
+    </w:p>
+    <w:p>
+      <w:pPr>
+        <w:pStyle w:val="ListBullet"/>
+      </w:pPr>
+      <w:r>
+        <w:t>/claims не использует DedicatedSmp.accepts. Корень только открывает JEM UI, а права на изменения повторно проверяются через FlanBridge.</w:t>
+      </w:r>
+    </w:p>
+    <w:p>
+      <w:pPr>
+        <w:pStyle w:val="ListBullet"/>
+      </w:pPr>
+      <w:r>
+        <w:t>/tpa accept и /tpaccept принадлежат JEM-адаптеру: он очищает недействительные запросы, но само принятие и телепортацию оставляет установленному TPA-моду.</w:t>
+      </w:r>
+    </w:p>
+    <w:p>
+      <w:pPr>
         <w:pStyle w:val="Heading1"/>
         <w:keepNext/>
       </w:pPr>
@@ -9270,6 +11776,38 @@
           <w:sz w:val="21"/>
         </w:rPr>
         <w:t>Mods/JEMWorldBossTiers/.../TierCommands.java</w:t>
+      </w:r>
+    </w:p>
+    <w:p>
+      <w:pPr>
+        <w:pStyle w:val="ListBullet"/>
+      </w:pPr>
+      <w:r>
+        <w:t>Mods/JEMEconomy/.../command/CoinCommands.java, EconomyApi.java и MarketRuntime.java</w:t>
+      </w:r>
+    </w:p>
+    <w:p>
+      <w:pPr>
+        <w:pStyle w:val="ListBullet"/>
+      </w:pPr>
+      <w:r>
+        <w:t>Mods/JEMClaims/.../JemClaims.java, ClaimsMenus.java и FlanBridge.java</w:t>
+      </w:r>
+    </w:p>
+    <w:p>
+      <w:pPr>
+        <w:pStyle w:val="ListBullet"/>
+      </w:pPr>
+      <w:r>
+        <w:t>Mods/JEMServer/.../JemServer.java, DeathHistory.java, SleepVote.java, HomeTravel.java и Landmarks.java</w:t>
+      </w:r>
+    </w:p>
+    <w:p>
+      <w:pPr>
+        <w:pStyle w:val="ListBullet"/>
+      </w:pPr>
+      <w:r>
+        <w:t>Mods/JEMServer/.../compat/TpaCompat.java</w:t>
       </w:r>
     </w:p>
     <w:sectPr>

</xml_diff>